<commit_message>
fix: harden docx template rendering workflow
</commit_message>
<xml_diff>
--- a/hermes-local-lab/sources/docx-engine-v2/templates/general-proposal/template.docx
+++ b/hermes-local-lab/sources/docx-engine-v2/templates/general-proposal/template.docx
@@ -74,7 +74,7 @@
     <w:p/>
     <w:p>
       <w:pPr>
-        <w:pStyle w:val="88"/>
+        <w:pStyle w:val="21"/>
         <w:keepNext w:val="0"/>
         <w:keepLines w:val="0"/>
         <w:pageBreakBefore w:val="0"/>
@@ -92,18 +92,24 @@
         <w:jc w:val="center"/>
         <w:textAlignment w:val="auto"/>
       </w:pPr>
-      <w:bookmarkStart w:id="9" w:name="_GoBack"/>
-      <w:bookmarkEnd w:id="9"/>
       <w:r>
         <w:rPr>
           <w:rFonts w:hint="eastAsia"/>
         </w:rPr>
-        <w:t>{d.cover.title}</w:t>
-      </w:r>
-    </w:p>
-    <w:p>
-      <w:pPr>
-        <w:pStyle w:val="TJCoverSubtitle"/>
+        <w:t>{d.cover.titl</w:t>
+      </w:r>
+      <w:bookmarkStart w:id="6" w:name="_GoBack"/>
+      <w:bookmarkEnd w:id="6"/>
+      <w:r>
+        <w:rPr>
+          <w:rFonts w:hint="eastAsia"/>
+        </w:rPr>
+        <w:t>e}</w:t>
+      </w:r>
+    </w:p>
+    <w:p>
+      <w:pPr>
+        <w:pStyle w:val="22"/>
         <w:ind w:firstLine="420"/>
         <w:jc w:val="center"/>
         <w:rPr>
@@ -127,7 +133,7 @@
     </w:p>
     <w:p>
       <w:pPr>
-        <w:pStyle w:val="TJCoverMeta"/>
+        <w:pStyle w:val="23"/>
         <w:keepNext w:val="0"/>
         <w:keepLines w:val="0"/>
         <w:pageBreakBefore w:val="0"/>
@@ -143,13 +149,13 @@
         <w:snapToGrid/>
         <w:spacing w:before="4565" w:beforeLines="1400"/>
         <w:ind w:left="0" w:leftChars="0" w:firstLine="0" w:firstLineChars="0"/>
+        <w:jc w:val="left"/>
         <w:textAlignment w:val="auto"/>
         <w:rPr>
           <w:rFonts w:hint="eastAsia" w:asciiTheme="minorEastAsia" w:hAnsiTheme="minorEastAsia" w:eastAsiaTheme="minorEastAsia" w:cstheme="minorEastAsia"/>
           <w:sz w:val="28"/>
           <w:szCs w:val="28"/>
         </w:rPr>
-        <w:jc w:val="left"/>
       </w:pPr>
       <w:r>
         <w:rPr>
@@ -162,15 +168,15 @@
     </w:p>
     <w:p>
       <w:pPr>
-        <w:pStyle w:val="TJCoverMeta"/>
+        <w:pStyle w:val="23"/>
         <w:bidi w:val="0"/>
         <w:ind w:left="0" w:leftChars="0" w:firstLine="0" w:firstLineChars="0"/>
+        <w:jc w:val="left"/>
         <w:rPr>
           <w:rFonts w:hint="eastAsia" w:asciiTheme="minorEastAsia" w:hAnsiTheme="minorEastAsia" w:eastAsiaTheme="minorEastAsia" w:cstheme="minorEastAsia"/>
           <w:sz w:val="28"/>
           <w:szCs w:val="28"/>
         </w:rPr>
-        <w:jc w:val="left"/>
       </w:pPr>
       <w:r>
         <w:rPr>
@@ -183,15 +189,15 @@
     </w:p>
     <w:p>
       <w:pPr>
-        <w:pStyle w:val="TJCoverMeta"/>
+        <w:pStyle w:val="23"/>
         <w:bidi w:val="0"/>
         <w:ind w:left="0" w:leftChars="0" w:firstLine="0" w:firstLineChars="0"/>
+        <w:jc w:val="left"/>
         <w:rPr>
           <w:rFonts w:hint="eastAsia" w:asciiTheme="minorEastAsia" w:hAnsiTheme="minorEastAsia" w:eastAsiaTheme="minorEastAsia" w:cstheme="minorEastAsia"/>
           <w:sz w:val="28"/>
           <w:szCs w:val="28"/>
         </w:rPr>
-        <w:jc w:val="left"/>
       </w:pPr>
       <w:r>
         <w:rPr>
@@ -204,15 +210,15 @@
     </w:p>
     <w:p>
       <w:pPr>
-        <w:pStyle w:val="TJCoverMeta"/>
+        <w:pStyle w:val="23"/>
         <w:bidi w:val="0"/>
         <w:ind w:left="0" w:leftChars="0" w:firstLine="0" w:firstLineChars="0"/>
+        <w:jc w:val="left"/>
         <w:rPr>
           <w:rFonts w:hint="eastAsia" w:asciiTheme="minorEastAsia" w:hAnsiTheme="minorEastAsia" w:eastAsiaTheme="minorEastAsia" w:cstheme="minorEastAsia"/>
           <w:sz w:val="28"/>
           <w:szCs w:val="28"/>
         </w:rPr>
-        <w:jc w:val="left"/>
       </w:pPr>
       <w:r>
         <w:rPr>
@@ -225,14 +231,14 @@
     </w:p>
     <w:p>
       <w:pPr>
-        <w:pStyle w:val="TJCoverMeta"/>
+        <w:pStyle w:val="23"/>
         <w:ind w:left="0" w:leftChars="0" w:firstLine="0" w:firstLineChars="0"/>
+        <w:jc w:val="left"/>
         <w:rPr>
           <w:rFonts w:hint="eastAsia" w:asciiTheme="minorEastAsia" w:hAnsiTheme="minorEastAsia" w:eastAsiaTheme="minorEastAsia" w:cstheme="minorEastAsia"/>
           <w:sz w:val="28"/>
           <w:szCs w:val="28"/>
         </w:rPr>
-        <w:jc w:val="left"/>
       </w:pPr>
       <w:r>
         <w:rPr>
@@ -245,7 +251,7 @@
     </w:p>
     <w:p>
       <w:pPr>
-        <w:pStyle w:val="86"/>
+        <w:pStyle w:val="24"/>
         <w:jc w:val="center"/>
         <w:rPr>
           <w:rFonts w:ascii="Times New Roman" w:hAnsi="Times New Roman" w:eastAsia="宋体" w:cstheme="minorBidi"/>
@@ -274,7 +280,7 @@
     </w:p>
     <w:p>
       <w:pPr>
-        <w:pStyle w:val="86"/>
+        <w:pStyle w:val="24"/>
         <w:jc w:val="center"/>
       </w:pPr>
       <w:r>
@@ -286,10 +292,7 @@
     </w:p>
     <w:p>
       <w:pPr>
-        <w:pStyle w:val="32"/>
-        <w:tabs>
-          <w:tab w:val="right" w:leader="dot" w:pos="8306"/>
-        </w:tabs>
+        <w:pStyle w:val="13"/>
       </w:pPr>
       <w:r>
         <w:fldChar w:fldCharType="begin"/>
@@ -310,7 +313,7 @@
     <w:p/>
     <w:p>
       <w:pPr>
-        <w:pStyle w:val="86"/>
+        <w:pStyle w:val="24"/>
         <w:jc w:val="center"/>
       </w:pPr>
       <w:r>
@@ -322,10 +325,7 @@
     </w:p>
     <w:p>
       <w:pPr>
-        <w:pStyle w:val="32"/>
-        <w:tabs>
-          <w:tab w:val="right" w:leader="dot" w:pos="8306"/>
-        </w:tabs>
+        <w:pStyle w:val="13"/>
       </w:pPr>
       <w:r>
         <w:fldChar w:fldCharType="begin"/>
@@ -346,7 +346,7 @@
     <w:p/>
     <w:p>
       <w:pPr>
-        <w:pStyle w:val="86"/>
+        <w:pStyle w:val="24"/>
         <w:jc w:val="center"/>
       </w:pPr>
       <w:r>
@@ -358,10 +358,7 @@
     </w:p>
     <w:p>
       <w:pPr>
-        <w:pStyle w:val="32"/>
-        <w:tabs>
-          <w:tab w:val="right" w:leader="dot" w:pos="8306"/>
-        </w:tabs>
+        <w:pStyle w:val="13"/>
       </w:pPr>
       <w:r>
         <w:fldChar w:fldCharType="begin"/>
@@ -405,14 +402,14 @@
           <w:rFonts w:hint="eastAsia"/>
         </w:rPr>
       </w:pPr>
-      <w:bookmarkStart w:id="1" w:name="_Toc953072619"/>
+      <w:bookmarkStart w:id="0" w:name="_Toc953072619"/>
       <w:r>
         <w:rPr>
           <w:rFonts w:hint="eastAsia"/>
         </w:rPr>
         <w:t>{d.chapters[i].title}</w:t>
       </w:r>
-      <w:bookmarkEnd w:id="1"/>
+      <w:bookmarkEnd w:id="0"/>
     </w:p>
     <w:p>
       <w:pPr>
@@ -422,14 +419,14 @@
           <w:rFonts w:hint="eastAsia"/>
         </w:rPr>
       </w:pPr>
-      <w:bookmarkStart w:id="2" w:name="_Toc210984560"/>
+      <w:bookmarkStart w:id="1" w:name="_Toc210984560"/>
       <w:r>
         <w:rPr>
           <w:rFonts w:hint="eastAsia"/>
         </w:rPr>
         <w:t>{d.chapters[i].sections[i].title}</w:t>
       </w:r>
-      <w:bookmarkEnd w:id="2"/>
+      <w:bookmarkEnd w:id="1"/>
     </w:p>
     <w:p>
       <w:pPr>
@@ -469,46 +466,46 @@
           <w:rFonts w:hint="eastAsia"/>
         </w:rPr>
       </w:pPr>
-      <w:bookmarkStart w:id="3" w:name="_Toc521998723"/>
+      <w:bookmarkStart w:id="2" w:name="_Toc521998723"/>
       <w:r>
         <w:rPr>
           <w:rFonts w:hint="eastAsia"/>
         </w:rPr>
         <w:t>{d.chapters[i].sections[i+1].title}</w:t>
       </w:r>
-      <w:bookmarkEnd w:id="3"/>
+      <w:bookmarkEnd w:id="2"/>
     </w:p>
     <w:p>
       <w:pPr>
         <w:pStyle w:val="2"/>
         <w:bidi w:val="0"/>
       </w:pPr>
-      <w:bookmarkStart w:id="4" w:name="_Toc761839466"/>
+      <w:bookmarkStart w:id="3" w:name="_Toc761839466"/>
       <w:r>
         <w:rPr>
           <w:rFonts w:hint="eastAsia"/>
         </w:rPr>
         <w:t>{d.chapters[i+1].title}</w:t>
       </w:r>
-      <w:bookmarkEnd w:id="4"/>
+      <w:bookmarkEnd w:id="3"/>
     </w:p>
     <w:p>
       <w:pPr>
         <w:pStyle w:val="2"/>
         <w:bidi w:val="0"/>
       </w:pPr>
-      <w:bookmarkStart w:id="5" w:name="_Toc938401648"/>
+      <w:bookmarkStart w:id="4" w:name="_Toc938401648"/>
       <w:r>
         <w:rPr>
           <w:rFonts w:hint="eastAsia"/>
         </w:rPr>
         <w:t>附表</w:t>
       </w:r>
-      <w:bookmarkEnd w:id="5"/>
-    </w:p>
-    <w:p>
-      <w:pPr>
-        <w:pStyle w:val="110"/>
+      <w:bookmarkEnd w:id="4"/>
+    </w:p>
+    <w:p>
+      <w:pPr>
+        <w:pStyle w:val="25"/>
         <w:bidi w:val="0"/>
         <w:jc w:val="center"/>
       </w:pPr>
@@ -536,8 +533,8 @@
     </w:p>
     <w:tbl>
       <w:tblPr>
-        <w:tblStyle w:val="51"/>
-        <w:tblW w:w="0" w:type="auto"/>
+        <w:tblStyle w:val="18"/>
+        <w:tblW w:w="5000" w:type="pct"/>
         <w:tblInd w:w="0" w:type="dxa"/>
         <w:tblBorders>
           <w:top w:val="single" w:color="auto" w:sz="4" w:space="0"/>
@@ -556,40 +553,44 @@
         </w:tblCellMar>
       </w:tblPr>
       <w:tblGrid>
-        <w:gridCol w:w="2263"/>
-        <w:gridCol w:w="2086"/>
-        <w:gridCol w:w="2086"/>
-        <w:gridCol w:w="2087"/>
+        <w:gridCol w:w="2216"/>
+        <w:gridCol w:w="2110"/>
+        <w:gridCol w:w="2110"/>
+        <w:gridCol w:w="2110"/>
       </w:tblGrid>
       <w:tr>
+        <w:trPr>
+          <w:trHeight w:val="0" w:hRule="atLeast"/>
+        </w:trPr>
         <w:tc>
           <w:tcPr>
-            <w:tcW w:w="2130" w:type="dxa"/>
-            <w:vAlign w:val="center"/>
+            <w:tcW w:w="1296" w:type="pct"/>
             <w:tcMar>
               <w:top w:w="80" w:type="dxa"/>
+              <w:left w:w="120" w:type="dxa"/>
               <w:bottom w:w="80" w:type="dxa"/>
-              <w:left w:w="120" w:type="dxa"/>
               <w:right w:w="120" w:type="dxa"/>
             </w:tcMar>
+            <w:vAlign w:val="center"/>
           </w:tcPr>
           <w:p>
             <w:pPr>
-              <w:pStyle w:val="TJTableHeader"/>
+              <w:pStyle w:val="26"/>
+              <w:snapToGrid w:val="0"/>
               <w:ind w:left="0" w:leftChars="0" w:firstLine="0" w:firstLineChars="0"/>
-              <w:rPr>
-                <w:vertAlign w:val="baseline"/>
-              </w:rPr>
-              <w:jc w:val="center"/>
+              <w:jc w:val="left"/>
+              <w:rPr>
+                <w:vertAlign w:val="baseline"/>
+              </w:rPr>
             </w:pPr>
             <w:r>
               <w:rPr>
-                <w:rFonts w:hint="eastAsia" w:eastAsia="黑体" w:ascii="Times New Roman" w:hAnsi="Times New Roman"/>
-                <w:vertAlign w:val="baseline"/>
+                <w:rFonts w:hint="eastAsia" w:ascii="Times New Roman" w:hAnsi="Times New Roman" w:eastAsia="黑体"/>
+                <w:b/>
+                <w:bCs/>
                 <w:sz w:val="21"/>
                 <w:szCs w:val="21"/>
-                <w:b/>
-                <w:bCs/>
+                <w:vertAlign w:val="baseline"/>
               </w:rPr>
               <w:t>{d.tables[i].headers.c1}</w:t>
             </w:r>
@@ -597,55 +598,56 @@
         </w:tc>
         <w:tc>
           <w:tcPr>
-            <w:tcW w:w="2130" w:type="dxa"/>
-            <w:vAlign w:val="center"/>
+            <w:tcW w:w="1234" w:type="pct"/>
             <w:tcMar>
               <w:top w:w="80" w:type="dxa"/>
+              <w:left w:w="120" w:type="dxa"/>
               <w:bottom w:w="80" w:type="dxa"/>
-              <w:left w:w="120" w:type="dxa"/>
               <w:right w:w="120" w:type="dxa"/>
             </w:tcMar>
+            <w:vAlign w:val="center"/>
           </w:tcPr>
           <w:p>
             <w:pPr>
-              <w:pStyle w:val="TJTableHeader"/>
+              <w:pStyle w:val="26"/>
+              <w:snapToGrid w:val="0"/>
               <w:ind w:left="0" w:leftChars="0" w:firstLine="0" w:firstLineChars="0"/>
-              <w:rPr>
-                <w:vertAlign w:val="baseline"/>
-              </w:rPr>
-              <w:jc w:val="center"/>
+              <w:jc w:val="left"/>
+              <w:rPr>
+                <w:vertAlign w:val="baseline"/>
+              </w:rPr>
             </w:pPr>
             <w:r>
               <w:rPr>
-                <w:rFonts w:hint="eastAsia" w:eastAsia="黑体" w:ascii="Times New Roman" w:hAnsi="Times New Roman"/>
-                <w:vertAlign w:val="baseline"/>
+                <w:rFonts w:hint="eastAsia" w:ascii="Times New Roman" w:hAnsi="Times New Roman" w:eastAsia="黑体"/>
+                <w:b/>
+                <w:bCs/>
                 <w:sz w:val="21"/>
                 <w:szCs w:val="21"/>
-                <w:b/>
-                <w:bCs/>
+                <w:vertAlign w:val="baseline"/>
               </w:rPr>
               <w:t>{d.tables[i].headers.c</w:t>
             </w:r>
             <w:r>
               <w:rPr>
-                <w:rFonts w:hint="eastAsia" w:eastAsia="黑体" w:ascii="Times New Roman" w:hAnsi="Times New Roman"/>
-                <w:vertAlign w:val="baseline"/>
-                <w:lang w:val="en-US" w:eastAsia="zh-CN"/>
+                <w:rFonts w:hint="eastAsia" w:ascii="Times New Roman" w:hAnsi="Times New Roman" w:eastAsia="黑体"/>
+                <w:b/>
+                <w:bCs/>
                 <w:sz w:val="21"/>
                 <w:szCs w:val="21"/>
-                <w:b/>
-                <w:bCs/>
+                <w:vertAlign w:val="baseline"/>
+                <w:lang w:val="en-US" w:eastAsia="zh-CN"/>
               </w:rPr>
               <w:t>2</w:t>
             </w:r>
             <w:r>
               <w:rPr>
-                <w:rFonts w:hint="eastAsia" w:eastAsia="黑体" w:ascii="Times New Roman" w:hAnsi="Times New Roman"/>
-                <w:vertAlign w:val="baseline"/>
+                <w:rFonts w:hint="eastAsia" w:ascii="Times New Roman" w:hAnsi="Times New Roman" w:eastAsia="黑体"/>
+                <w:b/>
+                <w:bCs/>
                 <w:sz w:val="21"/>
                 <w:szCs w:val="21"/>
-                <w:b/>
-                <w:bCs/>
+                <w:vertAlign w:val="baseline"/>
               </w:rPr>
               <w:t>}</w:t>
             </w:r>
@@ -653,55 +655,56 @@
         </w:tc>
         <w:tc>
           <w:tcPr>
-            <w:tcW w:w="2131" w:type="dxa"/>
-            <w:vAlign w:val="center"/>
+            <w:tcW w:w="1234" w:type="pct"/>
             <w:tcMar>
               <w:top w:w="80" w:type="dxa"/>
+              <w:left w:w="120" w:type="dxa"/>
               <w:bottom w:w="80" w:type="dxa"/>
-              <w:left w:w="120" w:type="dxa"/>
               <w:right w:w="120" w:type="dxa"/>
             </w:tcMar>
+            <w:vAlign w:val="center"/>
           </w:tcPr>
           <w:p>
             <w:pPr>
-              <w:pStyle w:val="TJTableHeader"/>
+              <w:pStyle w:val="26"/>
+              <w:snapToGrid w:val="0"/>
               <w:ind w:left="0" w:leftChars="0" w:firstLine="0" w:firstLineChars="0"/>
-              <w:rPr>
-                <w:vertAlign w:val="baseline"/>
-              </w:rPr>
-              <w:jc w:val="center"/>
+              <w:jc w:val="left"/>
+              <w:rPr>
+                <w:vertAlign w:val="baseline"/>
+              </w:rPr>
             </w:pPr>
             <w:r>
               <w:rPr>
-                <w:rFonts w:hint="eastAsia" w:eastAsia="黑体" w:ascii="Times New Roman" w:hAnsi="Times New Roman"/>
-                <w:vertAlign w:val="baseline"/>
+                <w:rFonts w:hint="eastAsia" w:ascii="Times New Roman" w:hAnsi="Times New Roman" w:eastAsia="黑体"/>
+                <w:b/>
+                <w:bCs/>
                 <w:sz w:val="21"/>
                 <w:szCs w:val="21"/>
-                <w:b/>
-                <w:bCs/>
+                <w:vertAlign w:val="baseline"/>
               </w:rPr>
               <w:t>{d.tables[i].headers.c</w:t>
             </w:r>
             <w:r>
               <w:rPr>
-                <w:rFonts w:hint="eastAsia" w:eastAsia="黑体" w:ascii="Times New Roman" w:hAnsi="Times New Roman"/>
-                <w:vertAlign w:val="baseline"/>
-                <w:lang w:val="en-US" w:eastAsia="zh-CN"/>
+                <w:rFonts w:hint="eastAsia" w:ascii="Times New Roman" w:hAnsi="Times New Roman" w:eastAsia="黑体"/>
+                <w:b/>
+                <w:bCs/>
                 <w:sz w:val="21"/>
                 <w:szCs w:val="21"/>
-                <w:b/>
-                <w:bCs/>
+                <w:vertAlign w:val="baseline"/>
+                <w:lang w:val="en-US" w:eastAsia="zh-CN"/>
               </w:rPr>
               <w:t>3</w:t>
             </w:r>
             <w:r>
               <w:rPr>
-                <w:rFonts w:hint="eastAsia" w:eastAsia="黑体" w:ascii="Times New Roman" w:hAnsi="Times New Roman"/>
-                <w:vertAlign w:val="baseline"/>
+                <w:rFonts w:hint="eastAsia" w:ascii="Times New Roman" w:hAnsi="Times New Roman" w:eastAsia="黑体"/>
+                <w:b/>
+                <w:bCs/>
                 <w:sz w:val="21"/>
                 <w:szCs w:val="21"/>
-                <w:b/>
-                <w:bCs/>
+                <w:vertAlign w:val="baseline"/>
               </w:rPr>
               <w:t>}</w:t>
             </w:r>
@@ -709,55 +712,56 @@
         </w:tc>
         <w:tc>
           <w:tcPr>
-            <w:tcW w:w="2131" w:type="dxa"/>
-            <w:vAlign w:val="center"/>
+            <w:tcW w:w="1234" w:type="pct"/>
             <w:tcMar>
               <w:top w:w="80" w:type="dxa"/>
+              <w:left w:w="120" w:type="dxa"/>
               <w:bottom w:w="80" w:type="dxa"/>
-              <w:left w:w="120" w:type="dxa"/>
               <w:right w:w="120" w:type="dxa"/>
             </w:tcMar>
+            <w:vAlign w:val="center"/>
           </w:tcPr>
           <w:p>
             <w:pPr>
-              <w:pStyle w:val="TJTableHeader"/>
+              <w:pStyle w:val="26"/>
+              <w:snapToGrid w:val="0"/>
               <w:ind w:left="0" w:leftChars="0" w:firstLine="0" w:firstLineChars="0"/>
-              <w:rPr>
-                <w:vertAlign w:val="baseline"/>
-              </w:rPr>
-              <w:jc w:val="center"/>
+              <w:jc w:val="left"/>
+              <w:rPr>
+                <w:vertAlign w:val="baseline"/>
+              </w:rPr>
             </w:pPr>
             <w:r>
               <w:rPr>
-                <w:rFonts w:hint="eastAsia" w:eastAsia="黑体" w:ascii="Times New Roman" w:hAnsi="Times New Roman"/>
-                <w:vertAlign w:val="baseline"/>
+                <w:rFonts w:hint="eastAsia" w:ascii="Times New Roman" w:hAnsi="Times New Roman" w:eastAsia="黑体"/>
+                <w:b/>
+                <w:bCs/>
                 <w:sz w:val="21"/>
                 <w:szCs w:val="21"/>
-                <w:b/>
-                <w:bCs/>
+                <w:vertAlign w:val="baseline"/>
               </w:rPr>
               <w:t>{d.tables[i].headers.c</w:t>
             </w:r>
             <w:r>
               <w:rPr>
-                <w:rFonts w:hint="eastAsia" w:eastAsia="黑体" w:ascii="Times New Roman" w:hAnsi="Times New Roman"/>
-                <w:vertAlign w:val="baseline"/>
-                <w:lang w:val="en-US" w:eastAsia="zh-CN"/>
+                <w:rFonts w:hint="eastAsia" w:ascii="Times New Roman" w:hAnsi="Times New Roman" w:eastAsia="黑体"/>
+                <w:b/>
+                <w:bCs/>
                 <w:sz w:val="21"/>
                 <w:szCs w:val="21"/>
-                <w:b/>
-                <w:bCs/>
+                <w:vertAlign w:val="baseline"/>
+                <w:lang w:val="en-US" w:eastAsia="zh-CN"/>
               </w:rPr>
               <w:t>4</w:t>
             </w:r>
             <w:r>
               <w:rPr>
-                <w:rFonts w:hint="eastAsia" w:eastAsia="黑体" w:ascii="Times New Roman" w:hAnsi="Times New Roman"/>
-                <w:vertAlign w:val="baseline"/>
+                <w:rFonts w:hint="eastAsia" w:ascii="Times New Roman" w:hAnsi="Times New Roman" w:eastAsia="黑体"/>
+                <w:b/>
+                <w:bCs/>
                 <w:sz w:val="21"/>
                 <w:szCs w:val="21"/>
-                <w:b/>
-                <w:bCs/>
+                <w:vertAlign w:val="baseline"/>
               </w:rPr>
               <w:t>}</w:t>
             </w:r>
@@ -765,32 +769,36 @@
         </w:tc>
       </w:tr>
       <w:tr>
+        <w:trPr>
+          <w:trHeight w:val="0" w:hRule="atLeast"/>
+        </w:trPr>
         <w:tc>
           <w:tcPr>
-            <w:tcW w:w="2130" w:type="dxa"/>
-            <w:vAlign w:val="center"/>
+            <w:tcW w:w="1296" w:type="pct"/>
             <w:tcMar>
               <w:top w:w="80" w:type="dxa"/>
+              <w:left w:w="120" w:type="dxa"/>
               <w:bottom w:w="80" w:type="dxa"/>
-              <w:left w:w="120" w:type="dxa"/>
               <w:right w:w="120" w:type="dxa"/>
             </w:tcMar>
+            <w:vAlign w:val="center"/>
           </w:tcPr>
           <w:p>
             <w:pPr>
-              <w:pStyle w:val="TJTableCenter"/>
+              <w:pStyle w:val="28"/>
+              <w:snapToGrid w:val="0"/>
               <w:ind w:left="0" w:leftChars="0" w:firstLine="0" w:firstLineChars="0"/>
-              <w:rPr>
-                <w:vertAlign w:val="baseline"/>
-              </w:rPr>
-              <w:jc w:val="center"/>
+              <w:jc w:val="left"/>
+              <w:rPr>
+                <w:vertAlign w:val="baseline"/>
+              </w:rPr>
             </w:pPr>
             <w:r>
               <w:rPr>
-                <w:rFonts w:hint="eastAsia" w:eastAsia="宋体" w:ascii="Times New Roman" w:hAnsi="Times New Roman"/>
-                <w:vertAlign w:val="baseline"/>
+                <w:rFonts w:hint="eastAsia" w:ascii="Times New Roman" w:hAnsi="Times New Roman" w:eastAsia="宋体"/>
                 <w:sz w:val="21"/>
                 <w:szCs w:val="21"/>
+                <w:vertAlign w:val="baseline"/>
               </w:rPr>
               <w:t>{d.tables[i].rows[i].c1}</w:t>
             </w:r>
@@ -798,49 +806,50 @@
         </w:tc>
         <w:tc>
           <w:tcPr>
-            <w:tcW w:w="2130" w:type="dxa"/>
-            <w:vAlign w:val="center"/>
+            <w:tcW w:w="1234" w:type="pct"/>
             <w:tcMar>
               <w:top w:w="80" w:type="dxa"/>
+              <w:left w:w="120" w:type="dxa"/>
               <w:bottom w:w="80" w:type="dxa"/>
-              <w:left w:w="120" w:type="dxa"/>
               <w:right w:w="120" w:type="dxa"/>
             </w:tcMar>
+            <w:vAlign w:val="center"/>
           </w:tcPr>
           <w:p>
             <w:pPr>
-              <w:pStyle w:val="TJTableLeft"/>
+              <w:pStyle w:val="27"/>
+              <w:snapToGrid w:val="0"/>
               <w:ind w:left="0" w:leftChars="0" w:firstLine="0" w:firstLineChars="0"/>
-              <w:rPr>
-                <w:vertAlign w:val="baseline"/>
-              </w:rPr>
               <w:jc w:val="left"/>
+              <w:rPr>
+                <w:vertAlign w:val="baseline"/>
+              </w:rPr>
             </w:pPr>
             <w:r>
               <w:rPr>
-                <w:rFonts w:hint="eastAsia" w:eastAsia="宋体" w:ascii="Times New Roman" w:hAnsi="Times New Roman"/>
-                <w:vertAlign w:val="baseline"/>
+                <w:rFonts w:hint="eastAsia" w:ascii="Times New Roman" w:hAnsi="Times New Roman" w:eastAsia="宋体"/>
                 <w:sz w:val="21"/>
                 <w:szCs w:val="21"/>
+                <w:vertAlign w:val="baseline"/>
               </w:rPr>
               <w:t>{d.tables[i].rows[i].c</w:t>
             </w:r>
             <w:r>
               <w:rPr>
-                <w:rFonts w:hint="eastAsia" w:eastAsia="宋体" w:ascii="Times New Roman" w:hAnsi="Times New Roman"/>
-                <w:vertAlign w:val="baseline"/>
-                <w:lang w:val="en-US" w:eastAsia="zh-CN"/>
+                <w:rFonts w:hint="eastAsia" w:ascii="Times New Roman" w:hAnsi="Times New Roman" w:eastAsia="宋体"/>
                 <w:sz w:val="21"/>
                 <w:szCs w:val="21"/>
+                <w:vertAlign w:val="baseline"/>
+                <w:lang w:val="en-US" w:eastAsia="zh-CN"/>
               </w:rPr>
               <w:t>2</w:t>
             </w:r>
             <w:r>
               <w:rPr>
-                <w:rFonts w:hint="eastAsia" w:eastAsia="宋体" w:ascii="Times New Roman" w:hAnsi="Times New Roman"/>
-                <w:vertAlign w:val="baseline"/>
+                <w:rFonts w:hint="eastAsia" w:ascii="Times New Roman" w:hAnsi="Times New Roman" w:eastAsia="宋体"/>
                 <w:sz w:val="21"/>
                 <w:szCs w:val="21"/>
+                <w:vertAlign w:val="baseline"/>
               </w:rPr>
               <w:t>}</w:t>
             </w:r>
@@ -848,49 +857,50 @@
         </w:tc>
         <w:tc>
           <w:tcPr>
-            <w:tcW w:w="2131" w:type="dxa"/>
-            <w:vAlign w:val="center"/>
+            <w:tcW w:w="1234" w:type="pct"/>
             <w:tcMar>
               <w:top w:w="80" w:type="dxa"/>
+              <w:left w:w="120" w:type="dxa"/>
               <w:bottom w:w="80" w:type="dxa"/>
-              <w:left w:w="120" w:type="dxa"/>
               <w:right w:w="120" w:type="dxa"/>
             </w:tcMar>
+            <w:vAlign w:val="center"/>
           </w:tcPr>
           <w:p>
             <w:pPr>
-              <w:pStyle w:val="TJTableCenter"/>
+              <w:pStyle w:val="28"/>
+              <w:snapToGrid w:val="0"/>
               <w:ind w:left="0" w:leftChars="0" w:firstLine="0" w:firstLineChars="0"/>
-              <w:rPr>
-                <w:vertAlign w:val="baseline"/>
-              </w:rPr>
-              <w:jc w:val="center"/>
+              <w:jc w:val="left"/>
+              <w:rPr>
+                <w:vertAlign w:val="baseline"/>
+              </w:rPr>
             </w:pPr>
             <w:r>
               <w:rPr>
-                <w:rFonts w:hint="eastAsia" w:eastAsia="宋体" w:ascii="Times New Roman" w:hAnsi="Times New Roman"/>
-                <w:vertAlign w:val="baseline"/>
+                <w:rFonts w:hint="eastAsia" w:ascii="Times New Roman" w:hAnsi="Times New Roman" w:eastAsia="宋体"/>
                 <w:sz w:val="21"/>
                 <w:szCs w:val="21"/>
+                <w:vertAlign w:val="baseline"/>
               </w:rPr>
               <w:t>{d.tables[i].rows[i].c</w:t>
             </w:r>
             <w:r>
               <w:rPr>
-                <w:rFonts w:hint="eastAsia" w:eastAsia="宋体" w:ascii="Times New Roman" w:hAnsi="Times New Roman"/>
-                <w:vertAlign w:val="baseline"/>
-                <w:lang w:val="en-US" w:eastAsia="zh-CN"/>
+                <w:rFonts w:hint="eastAsia" w:ascii="Times New Roman" w:hAnsi="Times New Roman" w:eastAsia="宋体"/>
                 <w:sz w:val="21"/>
                 <w:szCs w:val="21"/>
+                <w:vertAlign w:val="baseline"/>
+                <w:lang w:val="en-US" w:eastAsia="zh-CN"/>
               </w:rPr>
               <w:t>3</w:t>
             </w:r>
             <w:r>
               <w:rPr>
-                <w:rFonts w:hint="eastAsia" w:eastAsia="宋体" w:ascii="Times New Roman" w:hAnsi="Times New Roman"/>
-                <w:vertAlign w:val="baseline"/>
+                <w:rFonts w:hint="eastAsia" w:ascii="Times New Roman" w:hAnsi="Times New Roman" w:eastAsia="宋体"/>
                 <w:sz w:val="21"/>
                 <w:szCs w:val="21"/>
+                <w:vertAlign w:val="baseline"/>
               </w:rPr>
               <w:t>}</w:t>
             </w:r>
@@ -898,49 +908,50 @@
         </w:tc>
         <w:tc>
           <w:tcPr>
-            <w:tcW w:w="2131" w:type="dxa"/>
-            <w:vAlign w:val="center"/>
+            <w:tcW w:w="1234" w:type="pct"/>
             <w:tcMar>
               <w:top w:w="80" w:type="dxa"/>
+              <w:left w:w="120" w:type="dxa"/>
               <w:bottom w:w="80" w:type="dxa"/>
-              <w:left w:w="120" w:type="dxa"/>
               <w:right w:w="120" w:type="dxa"/>
             </w:tcMar>
+            <w:vAlign w:val="center"/>
           </w:tcPr>
           <w:p>
             <w:pPr>
-              <w:pStyle w:val="TJTableLeft"/>
+              <w:pStyle w:val="27"/>
+              <w:snapToGrid w:val="0"/>
               <w:ind w:left="0" w:leftChars="0" w:firstLine="0" w:firstLineChars="0"/>
-              <w:rPr>
-                <w:vertAlign w:val="baseline"/>
-              </w:rPr>
               <w:jc w:val="left"/>
+              <w:rPr>
+                <w:vertAlign w:val="baseline"/>
+              </w:rPr>
             </w:pPr>
             <w:r>
               <w:rPr>
-                <w:rFonts w:hint="eastAsia" w:eastAsia="宋体" w:ascii="Times New Roman" w:hAnsi="Times New Roman"/>
-                <w:vertAlign w:val="baseline"/>
+                <w:rFonts w:hint="eastAsia" w:ascii="Times New Roman" w:hAnsi="Times New Roman" w:eastAsia="宋体"/>
                 <w:sz w:val="21"/>
                 <w:szCs w:val="21"/>
+                <w:vertAlign w:val="baseline"/>
               </w:rPr>
               <w:t>{d.tables[i].rows[i].c</w:t>
             </w:r>
             <w:r>
               <w:rPr>
-                <w:rFonts w:hint="eastAsia" w:eastAsia="宋体" w:ascii="Times New Roman" w:hAnsi="Times New Roman"/>
-                <w:vertAlign w:val="baseline"/>
-                <w:lang w:val="en-US" w:eastAsia="zh-CN"/>
+                <w:rFonts w:hint="eastAsia" w:ascii="Times New Roman" w:hAnsi="Times New Roman" w:eastAsia="宋体"/>
                 <w:sz w:val="21"/>
                 <w:szCs w:val="21"/>
+                <w:vertAlign w:val="baseline"/>
+                <w:lang w:val="en-US" w:eastAsia="zh-CN"/>
               </w:rPr>
               <w:t>4</w:t>
             </w:r>
             <w:r>
               <w:rPr>
-                <w:rFonts w:hint="eastAsia" w:eastAsia="宋体" w:ascii="Times New Roman" w:hAnsi="Times New Roman"/>
-                <w:vertAlign w:val="baseline"/>
+                <w:rFonts w:hint="eastAsia" w:ascii="Times New Roman" w:hAnsi="Times New Roman" w:eastAsia="宋体"/>
                 <w:sz w:val="21"/>
                 <w:szCs w:val="21"/>
+                <w:vertAlign w:val="baseline"/>
               </w:rPr>
               <w:t>}</w:t>
             </w:r>
@@ -948,32 +959,36 @@
         </w:tc>
       </w:tr>
       <w:tr>
+        <w:trPr>
+          <w:trHeight w:val="0" w:hRule="atLeast"/>
+        </w:trPr>
         <w:tc>
           <w:tcPr>
-            <w:tcW w:w="2130" w:type="dxa"/>
-            <w:vAlign w:val="center"/>
+            <w:tcW w:w="1296" w:type="pct"/>
             <w:tcMar>
               <w:top w:w="80" w:type="dxa"/>
+              <w:left w:w="120" w:type="dxa"/>
               <w:bottom w:w="80" w:type="dxa"/>
-              <w:left w:w="120" w:type="dxa"/>
               <w:right w:w="120" w:type="dxa"/>
             </w:tcMar>
+            <w:vAlign w:val="center"/>
           </w:tcPr>
           <w:p>
             <w:pPr>
-              <w:pStyle w:val="TJTableCenter"/>
+              <w:pStyle w:val="28"/>
+              <w:snapToGrid w:val="0"/>
               <w:ind w:left="0" w:leftChars="0" w:firstLine="0" w:firstLineChars="0"/>
-              <w:rPr>
-                <w:vertAlign w:val="baseline"/>
-              </w:rPr>
-              <w:jc w:val="center"/>
+              <w:jc w:val="left"/>
+              <w:rPr>
+                <w:vertAlign w:val="baseline"/>
+              </w:rPr>
             </w:pPr>
             <w:r>
               <w:rPr>
-                <w:rFonts w:hint="eastAsia" w:eastAsia="宋体" w:ascii="Times New Roman" w:hAnsi="Times New Roman"/>
-                <w:vertAlign w:val="baseline"/>
+                <w:rFonts w:hint="eastAsia" w:ascii="Times New Roman" w:hAnsi="Times New Roman" w:eastAsia="宋体"/>
                 <w:sz w:val="21"/>
                 <w:szCs w:val="21"/>
+                <w:vertAlign w:val="baseline"/>
               </w:rPr>
               <w:t>{d.tables[i].rows[i+1].c1}</w:t>
             </w:r>
@@ -981,67 +996,70 @@
         </w:tc>
         <w:tc>
           <w:tcPr>
-            <w:tcW w:w="2130" w:type="dxa"/>
-            <w:vAlign w:val="center"/>
+            <w:tcW w:w="1234" w:type="pct"/>
             <w:tcMar>
               <w:top w:w="80" w:type="dxa"/>
+              <w:left w:w="120" w:type="dxa"/>
               <w:bottom w:w="80" w:type="dxa"/>
-              <w:left w:w="120" w:type="dxa"/>
               <w:right w:w="120" w:type="dxa"/>
             </w:tcMar>
+            <w:vAlign w:val="center"/>
           </w:tcPr>
           <w:p>
             <w:pPr>
-              <w:pStyle w:val="TJTableLeft"/>
+              <w:pStyle w:val="27"/>
+              <w:snapToGrid w:val="0"/>
               <w:ind w:left="0" w:leftChars="0" w:firstLine="0" w:firstLineChars="0"/>
-              <w:rPr>
-                <w:vertAlign w:val="baseline"/>
-              </w:rPr>
               <w:jc w:val="left"/>
+              <w:rPr>
+                <w:vertAlign w:val="baseline"/>
+              </w:rPr>
             </w:pPr>
           </w:p>
         </w:tc>
         <w:tc>
           <w:tcPr>
-            <w:tcW w:w="2131" w:type="dxa"/>
-            <w:vAlign w:val="center"/>
+            <w:tcW w:w="1234" w:type="pct"/>
             <w:tcMar>
               <w:top w:w="80" w:type="dxa"/>
+              <w:left w:w="120" w:type="dxa"/>
               <w:bottom w:w="80" w:type="dxa"/>
-              <w:left w:w="120" w:type="dxa"/>
               <w:right w:w="120" w:type="dxa"/>
             </w:tcMar>
+            <w:vAlign w:val="center"/>
           </w:tcPr>
           <w:p>
             <w:pPr>
-              <w:pStyle w:val="TJTableCenter"/>
+              <w:pStyle w:val="28"/>
+              <w:snapToGrid w:val="0"/>
               <w:ind w:left="0" w:leftChars="0" w:firstLine="0" w:firstLineChars="0"/>
-              <w:rPr>
-                <w:vertAlign w:val="baseline"/>
-              </w:rPr>
-              <w:jc w:val="center"/>
+              <w:jc w:val="left"/>
+              <w:rPr>
+                <w:vertAlign w:val="baseline"/>
+              </w:rPr>
             </w:pPr>
           </w:p>
         </w:tc>
         <w:tc>
           <w:tcPr>
-            <w:tcW w:w="2131" w:type="dxa"/>
-            <w:vAlign w:val="center"/>
+            <w:tcW w:w="1234" w:type="pct"/>
             <w:tcMar>
               <w:top w:w="80" w:type="dxa"/>
+              <w:left w:w="120" w:type="dxa"/>
               <w:bottom w:w="80" w:type="dxa"/>
-              <w:left w:w="120" w:type="dxa"/>
               <w:right w:w="120" w:type="dxa"/>
             </w:tcMar>
+            <w:vAlign w:val="center"/>
           </w:tcPr>
           <w:p>
             <w:pPr>
-              <w:pStyle w:val="TJTableLeft"/>
+              <w:pStyle w:val="27"/>
+              <w:snapToGrid w:val="0"/>
               <w:ind w:left="0" w:leftChars="0" w:firstLine="0" w:firstLineChars="0"/>
-              <w:rPr>
-                <w:vertAlign w:val="baseline"/>
-              </w:rPr>
               <w:jc w:val="left"/>
+              <w:rPr>
+                <w:vertAlign w:val="baseline"/>
+              </w:rPr>
             </w:pPr>
           </w:p>
         </w:tc>
@@ -1049,7 +1067,7 @@
     </w:tbl>
     <w:p>
       <w:pPr>
-        <w:pStyle w:val="110"/>
+        <w:pStyle w:val="25"/>
         <w:bidi w:val="0"/>
         <w:jc w:val="center"/>
       </w:pPr>
@@ -1078,17 +1096,24 @@
     <w:p/>
     <w:tbl>
       <w:tblPr>
+        <w:tblStyle w:val="17"/>
         <w:tblW w:w="8306" w:type="dxa"/>
         <w:jc w:val="center"/>
         <w:tblBorders>
-          <w:top w:val="single" w:sz="8" w:space="0" w:color="BFBFBF"/>
-          <w:left w:val="single" w:sz="8" w:space="0" w:color="BFBFBF"/>
-          <w:bottom w:val="single" w:sz="8" w:space="0" w:color="BFBFBF"/>
-          <w:right w:val="single" w:sz="8" w:space="0" w:color="BFBFBF"/>
-          <w:insideH w:val="single" w:sz="8" w:space="0" w:color="BFBFBF"/>
-          <w:insideV w:val="single" w:sz="8" w:space="0" w:color="BFBFBF"/>
+          <w:top w:val="single" w:color="BFBFBF" w:sz="8" w:space="0"/>
+          <w:left w:val="single" w:color="BFBFBF" w:sz="8" w:space="0"/>
+          <w:bottom w:val="single" w:color="BFBFBF" w:sz="8" w:space="0"/>
+          <w:right w:val="single" w:color="BFBFBF" w:sz="8" w:space="0"/>
+          <w:insideH w:val="single" w:color="BFBFBF" w:sz="8" w:space="0"/>
+          <w:insideV w:val="single" w:color="BFBFBF" w:sz="8" w:space="0"/>
         </w:tblBorders>
         <w:tblLayout w:type="fixed"/>
+        <w:tblCellMar>
+          <w:top w:w="0" w:type="dxa"/>
+          <w:left w:w="10" w:type="dxa"/>
+          <w:bottom w:w="0" w:type="dxa"/>
+          <w:right w:w="10" w:type="dxa"/>
+        </w:tblCellMar>
       </w:tblPr>
       <w:tblGrid>
         <w:gridCol w:w="8306"/>
@@ -1096,29 +1121,32 @@
       <w:tr>
         <w:trPr>
           <w:trHeight w:val="2600" w:hRule="atLeast"/>
+          <w:jc w:val="center"/>
         </w:trPr>
         <w:tc>
           <w:tcPr>
             <w:tcW w:w="8306" w:type="dxa"/>
             <w:shd w:val="clear" w:color="auto" w:fill="F2F2F2"/>
-            <w:vAlign w:val="center"/>
             <w:tcMar>
               <w:top w:w="80" w:type="dxa"/>
+              <w:left w:w="120" w:type="dxa"/>
               <w:bottom w:w="80" w:type="dxa"/>
-              <w:left w:w="120" w:type="dxa"/>
               <w:right w:w="120" w:type="dxa"/>
             </w:tcMar>
+            <w:vAlign w:val="center"/>
           </w:tcPr>
           <w:p>
             <w:pPr>
-              <w:pStyle w:val="TJFigurePlaceholder"/>
+              <w:pStyle w:val="30"/>
               <w:jc w:val="center"/>
             </w:pPr>
             <w:r>
               <w:t>图片占位：{d.figures[0].description}</w:t>
             </w:r>
             <w:r>
-              <w:br/>
+              <w:br w:type="textWrapping"/>
+            </w:r>
+            <w:r>
               <w:t>建议宽度不超过正文宽度，居中显示；图片下方统一使用“图 1 标题”格式。</w:t>
             </w:r>
           </w:p>
@@ -1127,7 +1155,7 @@
     </w:tbl>
     <w:p>
       <w:pPr>
-        <w:pStyle w:val="110"/>
+        <w:pStyle w:val="25"/>
         <w:spacing w:before="120" w:after="120"/>
         <w:jc w:val="center"/>
       </w:pPr>
@@ -1162,14 +1190,14 @@
           <w:rFonts w:hint="eastAsia"/>
         </w:rPr>
       </w:pPr>
-      <w:bookmarkStart w:id="8" w:name="_Toc1257115791"/>
+      <w:bookmarkStart w:id="5" w:name="_Toc1257115791"/>
       <w:r>
         <w:rPr>
           <w:rFonts w:hint="eastAsia"/>
         </w:rPr>
         <w:t>{d.conclusion.title}</w:t>
       </w:r>
-      <w:bookmarkEnd w:id="8"/>
+      <w:bookmarkEnd w:id="5"/>
     </w:p>
     <w:p>
       <w:pPr>
@@ -1198,7 +1226,6 @@
         <w:t>{d.conclusion.paragraphs[i+1].text}</w:t>
       </w:r>
     </w:p>
-    <w:bookmarkEnd w:id="0"/>
     <w:p>
       <w:pPr>
         <w:ind w:firstLine="0"/>
@@ -1252,13 +1279,13 @@
 <w:ftr xmlns:wpc="http://schemas.microsoft.com/office/word/2010/wordprocessingCanvas" xmlns:mc="http://schemas.openxmlformats.org/markup-compatibility/2006" xmlns:o="urn:schemas-microsoft-com:office:office" xmlns:r="http://schemas.openxmlformats.org/officeDocument/2006/relationships" xmlns:m="http://schemas.openxmlformats.org/officeDocument/2006/math" xmlns:v="urn:schemas-microsoft-com:vml" xmlns:wp14="http://schemas.microsoft.com/office/word/2010/wordprocessingDrawing" xmlns:wp="http://schemas.openxmlformats.org/drawingml/2006/wordprocessingDrawing" xmlns:w10="urn:schemas-microsoft-com:office:word" xmlns:w="http://schemas.openxmlformats.org/wordprocessingml/2006/main" xmlns:w14="http://schemas.microsoft.com/office/word/2010/wordml" xmlns:w15="http://schemas.microsoft.com/office/word/2012/wordml" xmlns:wpg="http://schemas.microsoft.com/office/word/2010/wordprocessingGroup" xmlns:wpi="http://schemas.microsoft.com/office/word/2010/wordprocessingInk" xmlns:wne="http://schemas.microsoft.com/office/word/2006/wordml" xmlns:wps="http://schemas.microsoft.com/office/word/2010/wordprocessingShape" xmlns:wpsCustomData="http://www.wps.cn/officeDocument/2013/wpsCustomData" mc:Ignorable="w14 w15 wp14">
   <w:p>
     <w:pPr>
-      <w:pStyle w:val="30"/>
+      <w:pStyle w:val="31"/>
       <w:jc w:val="center"/>
     </w:pPr>
   </w:p>
   <w:p>
     <w:pPr>
-      <w:pStyle w:val="30"/>
+      <w:pStyle w:val="31"/>
       <w:jc w:val="center"/>
     </w:pPr>
   </w:p>
@@ -1269,7 +1296,7 @@
 <w:ftr xmlns:wpc="http://schemas.microsoft.com/office/word/2010/wordprocessingCanvas" xmlns:mc="http://schemas.openxmlformats.org/markup-compatibility/2006" xmlns:o="urn:schemas-microsoft-com:office:office" xmlns:r="http://schemas.openxmlformats.org/officeDocument/2006/relationships" xmlns:m="http://schemas.openxmlformats.org/officeDocument/2006/math" xmlns:v="urn:schemas-microsoft-com:vml" xmlns:wp14="http://schemas.microsoft.com/office/word/2010/wordprocessingDrawing" xmlns:wp="http://schemas.openxmlformats.org/drawingml/2006/wordprocessingDrawing" xmlns:w10="urn:schemas-microsoft-com:office:word" xmlns:w="http://schemas.openxmlformats.org/wordprocessingml/2006/main" xmlns:w14="http://schemas.microsoft.com/office/word/2010/wordml" xmlns:w15="http://schemas.microsoft.com/office/word/2012/wordml" xmlns:wpg="http://schemas.microsoft.com/office/word/2010/wordprocessingGroup" xmlns:wpi="http://schemas.microsoft.com/office/word/2010/wordprocessingInk" xmlns:wne="http://schemas.microsoft.com/office/word/2006/wordml" xmlns:wps="http://schemas.microsoft.com/office/word/2010/wordprocessingShape" xmlns:wpsCustomData="http://www.wps.cn/officeDocument/2013/wpsCustomData" mc:Ignorable="w14 w15 wp14">
   <w:p>
     <w:pPr>
-      <w:pStyle w:val="30"/>
+      <w:pStyle w:val="31"/>
       <w:jc w:val="center"/>
     </w:pPr>
     <w:r>
@@ -1327,7 +1354,7 @@
                       <w:txbxContent>
                         <w:p>
                           <w:pPr>
-                            <w:pStyle w:val="30"/>
+                            <w:pStyle w:val="31"/>
                           </w:pPr>
                           <w:r>
                             <w:fldChar w:fldCharType="begin"/>
@@ -1367,7 +1394,7 @@
                 <w:txbxContent>
                   <w:p>
                     <w:pPr>
-                      <w:pStyle w:val="30"/>
+                      <w:pStyle w:val="31"/>
                     </w:pPr>
                     <w:r>
                       <w:fldChar w:fldCharType="begin"/>
@@ -1395,7 +1422,7 @@
   </w:p>
   <w:p>
     <w:pPr>
-      <w:pStyle w:val="30"/>
+      <w:pStyle w:val="31"/>
       <w:jc w:val="center"/>
     </w:pPr>
   </w:p>
@@ -1406,7 +1433,7 @@
 <w:ftr xmlns:wpc="http://schemas.microsoft.com/office/word/2010/wordprocessingCanvas" xmlns:mc="http://schemas.openxmlformats.org/markup-compatibility/2006" xmlns:o="urn:schemas-microsoft-com:office:office" xmlns:r="http://schemas.openxmlformats.org/officeDocument/2006/relationships" xmlns:m="http://schemas.openxmlformats.org/officeDocument/2006/math" xmlns:v="urn:schemas-microsoft-com:vml" xmlns:wp14="http://schemas.microsoft.com/office/word/2010/wordprocessingDrawing" xmlns:wp="http://schemas.openxmlformats.org/drawingml/2006/wordprocessingDrawing" xmlns:w10="urn:schemas-microsoft-com:office:word" xmlns:w="http://schemas.openxmlformats.org/wordprocessingml/2006/main" xmlns:w14="http://schemas.microsoft.com/office/word/2010/wordml" xmlns:w15="http://schemas.microsoft.com/office/word/2012/wordml" xmlns:wpg="http://schemas.microsoft.com/office/word/2010/wordprocessingGroup" xmlns:wpi="http://schemas.microsoft.com/office/word/2010/wordprocessingInk" xmlns:wne="http://schemas.microsoft.com/office/word/2006/wordml" xmlns:wps="http://schemas.microsoft.com/office/word/2010/wordprocessingShape" xmlns:wpsCustomData="http://www.wps.cn/officeDocument/2013/wpsCustomData" mc:Ignorable="w14 w15 wp14">
   <w:p>
     <w:pPr>
-      <w:pStyle w:val="30"/>
+      <w:pStyle w:val="31"/>
       <w:spacing w:before="120" w:after="120"/>
       <w:ind w:firstLine="360"/>
       <w:jc w:val="center"/>
@@ -1466,7 +1493,7 @@
                       <w:txbxContent>
                         <w:p>
                           <w:pPr>
-                            <w:pStyle w:val="30"/>
+                            <w:pStyle w:val="31"/>
                           </w:pPr>
                           <w:r>
                             <w:t xml:space="preserve">第 </w:t>
@@ -1530,7 +1557,7 @@
                 <w:txbxContent>
                   <w:p>
                     <w:pPr>
-                      <w:pStyle w:val="30"/>
+                      <w:pStyle w:val="31"/>
                     </w:pPr>
                     <w:r>
                       <w:t xml:space="preserve">第 </w:t>
@@ -1582,7 +1609,7 @@
   </w:p>
   <w:p>
     <w:pPr>
-      <w:pStyle w:val="30"/>
+      <w:pStyle w:val="31"/>
       <w:spacing w:before="120" w:after="120"/>
       <w:ind w:firstLine="360"/>
       <w:jc w:val="center"/>
@@ -1620,7 +1647,7 @@
 <w:hdr xmlns:wpc="http://schemas.microsoft.com/office/word/2010/wordprocessingCanvas" xmlns:mc="http://schemas.openxmlformats.org/markup-compatibility/2006" xmlns:o="urn:schemas-microsoft-com:office:office" xmlns:r="http://schemas.openxmlformats.org/officeDocument/2006/relationships" xmlns:m="http://schemas.openxmlformats.org/officeDocument/2006/math" xmlns:v="urn:schemas-microsoft-com:vml" xmlns:wp14="http://schemas.microsoft.com/office/word/2010/wordprocessingDrawing" xmlns:wp="http://schemas.openxmlformats.org/drawingml/2006/wordprocessingDrawing" xmlns:w10="urn:schemas-microsoft-com:office:word" xmlns:w="http://schemas.openxmlformats.org/wordprocessingml/2006/main" xmlns:w14="http://schemas.microsoft.com/office/word/2010/wordml" xmlns:w15="http://schemas.microsoft.com/office/word/2012/wordml" xmlns:wpg="http://schemas.microsoft.com/office/word/2010/wordprocessingGroup" xmlns:wpi="http://schemas.microsoft.com/office/word/2010/wordprocessingInk" xmlns:wne="http://schemas.microsoft.com/office/word/2006/wordml" xmlns:wps="http://schemas.microsoft.com/office/word/2010/wordprocessingShape" xmlns:wpsCustomData="http://www.wps.cn/officeDocument/2013/wpsCustomData" mc:Ignorable="w14 w15 wp14">
   <w:p>
     <w:pPr>
-      <w:pStyle w:val="31"/>
+      <w:pStyle w:val="32"/>
     </w:pPr>
     <w:r>
       <w:rPr>
@@ -1696,8 +1723,62 @@
 <w:hdr xmlns:wpc="http://schemas.microsoft.com/office/word/2010/wordprocessingCanvas" xmlns:mc="http://schemas.openxmlformats.org/markup-compatibility/2006" xmlns:o="urn:schemas-microsoft-com:office:office" xmlns:r="http://schemas.openxmlformats.org/officeDocument/2006/relationships" xmlns:m="http://schemas.openxmlformats.org/officeDocument/2006/math" xmlns:v="urn:schemas-microsoft-com:vml" xmlns:wp14="http://schemas.microsoft.com/office/word/2010/wordprocessingDrawing" xmlns:wp="http://schemas.openxmlformats.org/drawingml/2006/wordprocessingDrawing" xmlns:w10="urn:schemas-microsoft-com:office:word" xmlns:w="http://schemas.openxmlformats.org/wordprocessingml/2006/main" xmlns:w14="http://schemas.microsoft.com/office/word/2010/wordml" xmlns:w15="http://schemas.microsoft.com/office/word/2012/wordml" xmlns:wpg="http://schemas.microsoft.com/office/word/2010/wordprocessingGroup" xmlns:wpi="http://schemas.microsoft.com/office/word/2010/wordprocessingInk" xmlns:wne="http://schemas.microsoft.com/office/word/2006/wordml" xmlns:wps="http://schemas.microsoft.com/office/word/2010/wordprocessingShape" xmlns:wpsCustomData="http://www.wps.cn/officeDocument/2013/wpsCustomData" mc:Ignorable="w14 w15 wp14">
   <w:p>
     <w:pPr>
-      <w:pStyle w:val="31"/>
-    </w:pPr>
+      <w:pStyle w:val="32"/>
+    </w:pPr>
+    <w:r>
+      <w:rPr>
+        <w:rFonts w:hint="eastAsia" w:ascii="仿宋_GB2312" w:eastAsia="仿宋_GB2312"/>
+      </w:rPr>
+      <w:drawing>
+        <wp:anchor distT="0" distB="0" distL="114300" distR="114300" simplePos="0" relativeHeight="251665408" behindDoc="0" locked="0" layoutInCell="1" allowOverlap="0">
+          <wp:simplePos x="0" y="0"/>
+          <wp:positionH relativeFrom="column">
+            <wp:posOffset>79375</wp:posOffset>
+          </wp:positionH>
+          <wp:positionV relativeFrom="paragraph">
+            <wp:posOffset>24130</wp:posOffset>
+          </wp:positionV>
+          <wp:extent cx="1458595" cy="253365"/>
+          <wp:effectExtent l="0" t="0" r="14605" b="635"/>
+          <wp:wrapNone/>
+          <wp:docPr id="1" name="图片 1"/>
+          <wp:cNvGraphicFramePr>
+            <a:graphicFrameLocks xmlns:a="http://schemas.openxmlformats.org/drawingml/2006/main" noChangeAspect="1"/>
+          </wp:cNvGraphicFramePr>
+          <a:graphic xmlns:a="http://schemas.openxmlformats.org/drawingml/2006/main">
+            <a:graphicData uri="http://schemas.openxmlformats.org/drawingml/2006/picture">
+              <pic:pic xmlns:pic="http://schemas.openxmlformats.org/drawingml/2006/picture">
+                <pic:nvPicPr>
+                  <pic:cNvPr id="1" name="图片 1"/>
+                  <pic:cNvPicPr>
+                    <a:picLocks noChangeAspect="1"/>
+                  </pic:cNvPicPr>
+                </pic:nvPicPr>
+                <pic:blipFill>
+                  <a:blip r:embed="rId1"/>
+                  <a:stretch>
+                    <a:fillRect/>
+                  </a:stretch>
+                </pic:blipFill>
+                <pic:spPr>
+                  <a:xfrm>
+                    <a:off x="0" y="0"/>
+                    <a:ext cx="1458595" cy="253365"/>
+                  </a:xfrm>
+                  <a:prstGeom prst="rect">
+                    <a:avLst/>
+                  </a:prstGeom>
+                  <a:noFill/>
+                  <a:ln>
+                    <a:noFill/>
+                  </a:ln>
+                </pic:spPr>
+              </pic:pic>
+            </a:graphicData>
+          </a:graphic>
+        </wp:anchor>
+      </w:drawing>
+    </w:r>
     <w:r>
       <w:pict>
         <v:shape id="_x0000_s2050" o:spid="_x0000_s2050" o:spt="136" type="#_x0000_t136" style="position:absolute;left:0pt;height:130.25pt;width:456.95pt;mso-position-horizontal:center;mso-position-horizontal-relative:margin;mso-position-vertical:center;mso-position-vertical-relative:margin;rotation:20643840f;z-index:-251654144;mso-width-relative:page;mso-height-relative:page;" fillcolor="#C0C0C0" filled="t" stroked="f" coordsize="21600,21600" adj="10800">
@@ -1715,12 +1796,12 @@
 </file>
 
 <file path=word/numbering.xml><?xml version="1.0" encoding="utf-8"?>
-<w:numbering xmlns:wpc="http://schemas.microsoft.com/office/word/2010/wordprocessingCanvas" xmlns:mc="http://schemas.openxmlformats.org/markup-compatibility/2006" xmlns:o="urn:schemas-microsoft-com:office:office" xmlns:r="http://schemas.openxmlformats.org/officeDocument/2006/relationships" xmlns:m="http://schemas.openxmlformats.org/officeDocument/2006/math" xmlns:v="urn:schemas-microsoft-com:vml" xmlns:wp14="http://schemas.microsoft.com/office/word/2010/wordprocessingDrawing" xmlns:wp="http://schemas.openxmlformats.org/drawingml/2006/wordprocessingDrawing" xmlns:w10="urn:schemas-microsoft-com:office:word" xmlns:w="http://schemas.openxmlformats.org/wordprocessingml/2006/main" xmlns:w14="http://schemas.microsoft.com/office/word/2010/wordml" xmlns:wpg="http://schemas.microsoft.com/office/word/2010/wordprocessingGroup" xmlns:wpi="http://schemas.microsoft.com/office/word/2010/wordprocessingInk" xmlns:wne="http://schemas.microsoft.com/office/word/2006/wordml" xmlns:wps="http://schemas.microsoft.com/office/word/2010/wordprocessingShape" xmlns:wpsCustomData="http://www.wps.cn/officeDocument/2013/wpsCustomData">
-  <w:abstractNum w:abstractNumId="15">
+<w:numbering xmlns:wpc="http://schemas.microsoft.com/office/word/2010/wordprocessingCanvas" xmlns:mc="http://schemas.openxmlformats.org/markup-compatibility/2006" xmlns:o="urn:schemas-microsoft-com:office:office" xmlns:r="http://schemas.openxmlformats.org/officeDocument/2006/relationships" xmlns:m="http://schemas.openxmlformats.org/officeDocument/2006/math" xmlns:v="urn:schemas-microsoft-com:vml" xmlns:wp14="http://schemas.microsoft.com/office/word/2010/wordprocessingDrawing" xmlns:wp="http://schemas.openxmlformats.org/drawingml/2006/wordprocessingDrawing" xmlns:w10="urn:schemas-microsoft-com:office:word" xmlns:w="http://schemas.openxmlformats.org/wordprocessingml/2006/main" xmlns:w14="http://schemas.microsoft.com/office/word/2010/wordml" xmlns:wpg="http://schemas.microsoft.com/office/word/2010/wordprocessingGroup" xmlns:wpi="http://schemas.microsoft.com/office/word/2010/wordprocessingInk" xmlns:wne="http://schemas.microsoft.com/office/word/2006/wordml" xmlns:wps="http://schemas.microsoft.com/office/word/2010/wordprocessingShape" xmlns:wpsCustomData="http://www.wps.cn/officeDocument/2013/wpsCustomData" mc:Ignorable="w14 wp14">
+  <w:abstractNum w:abstractNumId="0">
     <w:nsid w:val="03A50001"/>
     <w:multiLevelType w:val="multilevel"/>
     <w:tmpl w:val="03A50001"/>
-    <w:lvl w:ilvl="0">
+    <w:lvl w:ilvl="0" w:tentative="0">
       <w:start w:val="1"/>
       <w:numFmt w:val="chineseCountingThousand"/>
       <w:pStyle w:val="2"/>
@@ -1728,7 +1809,7 @@
       <w:lvlText w:val="第%1章、"/>
       <w:lvlJc w:val="left"/>
       <w:pPr>
-        <w:ind w:left="0" w:hanging="0"/>
+        <w:ind w:left="0" w:firstLine="0"/>
       </w:pPr>
       <w:rPr>
         <w:rFonts w:ascii="Times New Roman" w:hAnsi="Times New Roman" w:eastAsia="黑体" w:cs="Times New Roman"/>
@@ -1738,7 +1819,7 @@
         <w:szCs w:val="28"/>
       </w:rPr>
     </w:lvl>
-    <w:lvl w:ilvl="1">
+    <w:lvl w:ilvl="1" w:tentative="0">
       <w:start w:val="1"/>
       <w:numFmt w:val="decimal"/>
       <w:pStyle w:val="4"/>
@@ -1747,7 +1828,7 @@
       <w:lvlText w:val="%1.%2"/>
       <w:lvlJc w:val="left"/>
       <w:pPr>
-        <w:ind w:left="0" w:hanging="0"/>
+        <w:ind w:left="0" w:firstLine="0"/>
       </w:pPr>
       <w:rPr>
         <w:rFonts w:ascii="Times New Roman" w:hAnsi="Times New Roman" w:eastAsia="黑体" w:cs="Times New Roman"/>
@@ -1757,7 +1838,7 @@
         <w:szCs w:val="28"/>
       </w:rPr>
     </w:lvl>
-    <w:lvl w:ilvl="2">
+    <w:lvl w:ilvl="2" w:tentative="0">
       <w:start w:val="1"/>
       <w:numFmt w:val="decimal"/>
       <w:pStyle w:val="5"/>
@@ -1766,7 +1847,7 @@
       <w:lvlText w:val="%1.%2.%3"/>
       <w:lvlJc w:val="left"/>
       <w:pPr>
-        <w:ind w:left="0" w:hanging="0"/>
+        <w:ind w:left="0" w:firstLine="0"/>
       </w:pPr>
       <w:rPr>
         <w:rFonts w:ascii="Times New Roman" w:hAnsi="Times New Roman" w:eastAsia="黑体" w:cs="Times New Roman"/>
@@ -1776,7 +1857,7 @@
         <w:szCs w:val="28"/>
       </w:rPr>
     </w:lvl>
-    <w:lvl w:ilvl="3">
+    <w:lvl w:ilvl="3" w:tentative="0">
       <w:start w:val="1"/>
       <w:numFmt w:val="decimal"/>
       <w:pStyle w:val="6"/>
@@ -1785,7 +1866,7 @@
       <w:lvlText w:val="%1.%2.%3.%4"/>
       <w:lvlJc w:val="left"/>
       <w:pPr>
-        <w:ind w:left="0" w:hanging="0"/>
+        <w:ind w:left="0" w:firstLine="0"/>
       </w:pPr>
       <w:rPr>
         <w:rFonts w:ascii="Times New Roman" w:hAnsi="Times New Roman" w:eastAsia="黑体" w:cs="Times New Roman"/>
@@ -1795,7 +1876,7 @@
         <w:szCs w:val="28"/>
       </w:rPr>
     </w:lvl>
-    <w:lvl w:ilvl="4">
+    <w:lvl w:ilvl="4" w:tentative="0">
       <w:start w:val="1"/>
       <w:numFmt w:val="decimal"/>
       <w:pStyle w:val="7"/>
@@ -1804,7 +1885,7 @@
       <w:lvlText w:val="%1.%2.%3.%4.%5"/>
       <w:lvlJc w:val="left"/>
       <w:pPr>
-        <w:ind w:left="0" w:hanging="0"/>
+        <w:ind w:left="0" w:firstLine="0"/>
       </w:pPr>
       <w:rPr>
         <w:rFonts w:ascii="Times New Roman" w:hAnsi="Times New Roman" w:eastAsia="黑体" w:cs="Times New Roman"/>
@@ -1814,7 +1895,7 @@
         <w:szCs w:val="28"/>
       </w:rPr>
     </w:lvl>
-    <w:lvl w:ilvl="5">
+    <w:lvl w:ilvl="5" w:tentative="0">
       <w:start w:val="1"/>
       <w:numFmt w:val="decimal"/>
       <w:pStyle w:val="8"/>
@@ -1823,7 +1904,7 @@
       <w:lvlText w:val="%1.%2.%3.%4.%5.%6"/>
       <w:lvlJc w:val="left"/>
       <w:pPr>
-        <w:ind w:left="0" w:hanging="0"/>
+        <w:ind w:left="0" w:firstLine="0"/>
       </w:pPr>
       <w:rPr>
         <w:rFonts w:ascii="Times New Roman" w:hAnsi="Times New Roman" w:eastAsia="黑体" w:cs="Times New Roman"/>
@@ -1833,7 +1914,7 @@
         <w:szCs w:val="24"/>
       </w:rPr>
     </w:lvl>
-    <w:lvl w:ilvl="6">
+    <w:lvl w:ilvl="6" w:tentative="0">
       <w:start w:val="1"/>
       <w:numFmt w:val="decimal"/>
       <w:pStyle w:val="9"/>
@@ -1842,7 +1923,7 @@
       <w:lvlText w:val="%1.%2.%3.%4.%5.%6.%7"/>
       <w:lvlJc w:val="left"/>
       <w:pPr>
-        <w:ind w:left="0" w:hanging="0"/>
+        <w:ind w:left="0" w:firstLine="0"/>
       </w:pPr>
       <w:rPr>
         <w:rFonts w:ascii="Times New Roman" w:hAnsi="Times New Roman" w:eastAsia="黑体" w:cs="Times New Roman"/>
@@ -1854,7 +1935,7 @@
     </w:lvl>
   </w:abstractNum>
   <w:num w:numId="1">
-    <w:abstractNumId w:val="15"/>
+    <w:abstractNumId w:val="0"/>
   </w:num>
 </w:numbering>
 </file>
@@ -1865,22 +1946,264 @@
     <w:rPrDefault>
       <w:rPr>
         <w:rFonts w:ascii="Times New Roman" w:hAnsi="Times New Roman" w:eastAsia="宋体" w:cs="Times New Roman"/>
-        <w:sz w:val="24"/>
-        <w:szCs w:val="24"/>
       </w:rPr>
     </w:rPrDefault>
-    <w:pPrDefault>
-      <w:pPr>
-        <w:spacing w:line="360" w:lineRule="auto"/>
-        <w:ind w:firstLine="480"/>
-        <w:jc w:val="both"/>
-      </w:pPr>
-    </w:pPrDefault>
+    <w:pPrDefault/>
   </w:docDefaults>
-  <w:style w:type="paragraph" w:styleId="1" w:default="1">
+  <w:latentStyles w:count="260" w:defQFormat="0" w:defUnhideWhenUsed="1" w:defSemiHidden="1" w:defUIPriority="99" w:defLockedState="0">
+    <w:lsdException w:qFormat="1" w:unhideWhenUsed="0" w:uiPriority="0" w:semiHidden="0" w:name="Normal"/>
+    <w:lsdException w:qFormat="1" w:unhideWhenUsed="0" w:uiPriority="9" w:semiHidden="0" w:name="heading 1"/>
+    <w:lsdException w:qFormat="1" w:unhideWhenUsed="0" w:uiPriority="9" w:semiHidden="0" w:name="heading 2"/>
+    <w:lsdException w:qFormat="1" w:unhideWhenUsed="0" w:uiPriority="9" w:semiHidden="0" w:name="heading 3"/>
+    <w:lsdException w:qFormat="1" w:unhideWhenUsed="0" w:uiPriority="9" w:semiHidden="0" w:name="heading 4"/>
+    <w:lsdException w:qFormat="1" w:unhideWhenUsed="0" w:uiPriority="9" w:semiHidden="0" w:name="heading 5"/>
+    <w:lsdException w:qFormat="1" w:unhideWhenUsed="0" w:uiPriority="9" w:semiHidden="0" w:name="heading 6"/>
+    <w:lsdException w:qFormat="1" w:unhideWhenUsed="0" w:uiPriority="9" w:semiHidden="0" w:name="heading 7"/>
+    <w:lsdException w:qFormat="1" w:uiPriority="0" w:name="heading 8"/>
+    <w:lsdException w:qFormat="1" w:uiPriority="0" w:name="heading 9"/>
+    <w:lsdException w:unhideWhenUsed="0" w:uiPriority="0" w:semiHidden="0" w:name="index 1"/>
+    <w:lsdException w:unhideWhenUsed="0" w:uiPriority="0" w:semiHidden="0" w:name="index 2"/>
+    <w:lsdException w:unhideWhenUsed="0" w:uiPriority="0" w:semiHidden="0" w:name="index 3"/>
+    <w:lsdException w:unhideWhenUsed="0" w:uiPriority="0" w:semiHidden="0" w:name="index 4"/>
+    <w:lsdException w:unhideWhenUsed="0" w:uiPriority="0" w:semiHidden="0" w:name="index 5"/>
+    <w:lsdException w:unhideWhenUsed="0" w:uiPriority="0" w:semiHidden="0" w:name="index 6"/>
+    <w:lsdException w:unhideWhenUsed="0" w:uiPriority="0" w:semiHidden="0" w:name="index 7"/>
+    <w:lsdException w:unhideWhenUsed="0" w:uiPriority="0" w:semiHidden="0" w:name="index 8"/>
+    <w:lsdException w:unhideWhenUsed="0" w:uiPriority="0" w:semiHidden="0" w:name="index 9"/>
+    <w:lsdException w:unhideWhenUsed="0" w:uiPriority="39" w:semiHidden="0" w:name="toc 1"/>
+    <w:lsdException w:unhideWhenUsed="0" w:uiPriority="39" w:semiHidden="0" w:name="toc 2"/>
+    <w:lsdException w:unhideWhenUsed="0" w:uiPriority="39" w:semiHidden="0" w:name="toc 3"/>
+    <w:lsdException w:unhideWhenUsed="0" w:uiPriority="39" w:semiHidden="0" w:name="toc 4"/>
+    <w:lsdException w:unhideWhenUsed="0" w:uiPriority="39" w:semiHidden="0" w:name="toc 5"/>
+    <w:lsdException w:unhideWhenUsed="0" w:uiPriority="39" w:semiHidden="0" w:name="toc 6"/>
+    <w:lsdException w:unhideWhenUsed="0" w:uiPriority="39" w:semiHidden="0" w:name="toc 7"/>
+    <w:lsdException w:unhideWhenUsed="0" w:uiPriority="0" w:semiHidden="0" w:name="toc 8"/>
+    <w:lsdException w:unhideWhenUsed="0" w:uiPriority="0" w:semiHidden="0" w:name="toc 9"/>
+    <w:lsdException w:unhideWhenUsed="0" w:uiPriority="0" w:semiHidden="0" w:name="Normal Indent"/>
+    <w:lsdException w:unhideWhenUsed="0" w:uiPriority="0" w:semiHidden="0" w:name="footnote text"/>
+    <w:lsdException w:unhideWhenUsed="0" w:uiPriority="0" w:semiHidden="0" w:name="annotation text"/>
+    <w:lsdException w:unhideWhenUsed="0" w:uiPriority="0" w:semiHidden="0" w:name="header"/>
+    <w:lsdException w:unhideWhenUsed="0" w:uiPriority="0" w:semiHidden="0" w:name="footer"/>
+    <w:lsdException w:unhideWhenUsed="0" w:uiPriority="0" w:semiHidden="0" w:name="index heading"/>
+    <w:lsdException w:qFormat="1" w:uiPriority="0" w:name="caption"/>
+    <w:lsdException w:unhideWhenUsed="0" w:uiPriority="0" w:semiHidden="0" w:name="table of figures"/>
+    <w:lsdException w:unhideWhenUsed="0" w:uiPriority="0" w:semiHidden="0" w:name="envelope address"/>
+    <w:lsdException w:unhideWhenUsed="0" w:uiPriority="0" w:semiHidden="0" w:name="envelope return"/>
+    <w:lsdException w:unhideWhenUsed="0" w:uiPriority="0" w:semiHidden="0" w:name="footnote reference"/>
+    <w:lsdException w:unhideWhenUsed="0" w:uiPriority="0" w:semiHidden="0" w:name="annotation reference"/>
+    <w:lsdException w:unhideWhenUsed="0" w:uiPriority="0" w:semiHidden="0" w:name="line number"/>
+    <w:lsdException w:unhideWhenUsed="0" w:uiPriority="0" w:semiHidden="0" w:name="page number"/>
+    <w:lsdException w:unhideWhenUsed="0" w:uiPriority="0" w:semiHidden="0" w:name="endnote reference"/>
+    <w:lsdException w:unhideWhenUsed="0" w:uiPriority="0" w:semiHidden="0" w:name="endnote text"/>
+    <w:lsdException w:unhideWhenUsed="0" w:uiPriority="0" w:semiHidden="0" w:name="table of authorities"/>
+    <w:lsdException w:unhideWhenUsed="0" w:uiPriority="0" w:semiHidden="0" w:name="macro"/>
+    <w:lsdException w:unhideWhenUsed="0" w:uiPriority="0" w:semiHidden="0" w:name="toa heading"/>
+    <w:lsdException w:unhideWhenUsed="0" w:uiPriority="0" w:semiHidden="0" w:name="List"/>
+    <w:lsdException w:unhideWhenUsed="0" w:uiPriority="0" w:semiHidden="0" w:name="List Bullet"/>
+    <w:lsdException w:unhideWhenUsed="0" w:uiPriority="0" w:semiHidden="0" w:name="List Number"/>
+    <w:lsdException w:unhideWhenUsed="0" w:uiPriority="0" w:semiHidden="0" w:name="List 2"/>
+    <w:lsdException w:unhideWhenUsed="0" w:uiPriority="0" w:semiHidden="0" w:name="List 3"/>
+    <w:lsdException w:unhideWhenUsed="0" w:uiPriority="0" w:semiHidden="0" w:name="List 4"/>
+    <w:lsdException w:unhideWhenUsed="0" w:uiPriority="0" w:semiHidden="0" w:name="List 5"/>
+    <w:lsdException w:unhideWhenUsed="0" w:uiPriority="0" w:semiHidden="0" w:name="List Bullet 2"/>
+    <w:lsdException w:unhideWhenUsed="0" w:uiPriority="0" w:semiHidden="0" w:name="List Bullet 3"/>
+    <w:lsdException w:unhideWhenUsed="0" w:uiPriority="0" w:semiHidden="0" w:name="List Bullet 4"/>
+    <w:lsdException w:unhideWhenUsed="0" w:uiPriority="0" w:semiHidden="0" w:name="List Bullet 5"/>
+    <w:lsdException w:unhideWhenUsed="0" w:uiPriority="0" w:semiHidden="0" w:name="List Number 2"/>
+    <w:lsdException w:unhideWhenUsed="0" w:uiPriority="0" w:semiHidden="0" w:name="List Number 3"/>
+    <w:lsdException w:unhideWhenUsed="0" w:uiPriority="0" w:semiHidden="0" w:name="List Number 4"/>
+    <w:lsdException w:unhideWhenUsed="0" w:uiPriority="0" w:semiHidden="0" w:name="List Number 5"/>
+    <w:lsdException w:qFormat="1" w:unhideWhenUsed="0" w:uiPriority="0" w:semiHidden="0" w:name="Title"/>
+    <w:lsdException w:unhideWhenUsed="0" w:uiPriority="0" w:semiHidden="0" w:name="Closing"/>
+    <w:lsdException w:unhideWhenUsed="0" w:uiPriority="0" w:semiHidden="0" w:name="Signature"/>
+    <w:lsdException w:unhideWhenUsed="0" w:uiPriority="99" w:semiHidden="0" w:name="Default Paragraph Font"/>
+    <w:lsdException w:unhideWhenUsed="0" w:uiPriority="0" w:semiHidden="0" w:name="Body Text"/>
+    <w:lsdException w:unhideWhenUsed="0" w:uiPriority="0" w:semiHidden="0" w:name="Body Text Indent"/>
+    <w:lsdException w:unhideWhenUsed="0" w:uiPriority="0" w:semiHidden="0" w:name="List Continue"/>
+    <w:lsdException w:unhideWhenUsed="0" w:uiPriority="0" w:semiHidden="0" w:name="List Continue 2"/>
+    <w:lsdException w:unhideWhenUsed="0" w:uiPriority="0" w:semiHidden="0" w:name="List Continue 3"/>
+    <w:lsdException w:unhideWhenUsed="0" w:uiPriority="0" w:semiHidden="0" w:name="List Continue 4"/>
+    <w:lsdException w:unhideWhenUsed="0" w:uiPriority="0" w:semiHidden="0" w:name="List Continue 5"/>
+    <w:lsdException w:unhideWhenUsed="0" w:uiPriority="0" w:semiHidden="0" w:name="Message Header"/>
+    <w:lsdException w:qFormat="1" w:unhideWhenUsed="0" w:uiPriority="0" w:semiHidden="0" w:name="Subtitle"/>
+    <w:lsdException w:unhideWhenUsed="0" w:uiPriority="0" w:semiHidden="0" w:name="Salutation"/>
+    <w:lsdException w:unhideWhenUsed="0" w:uiPriority="0" w:semiHidden="0" w:name="Date"/>
+    <w:lsdException w:unhideWhenUsed="0" w:uiPriority="0" w:semiHidden="0" w:name="Body Text First Indent"/>
+    <w:lsdException w:unhideWhenUsed="0" w:uiPriority="0" w:semiHidden="0" w:name="Body Text First Indent 2"/>
+    <w:lsdException w:unhideWhenUsed="0" w:uiPriority="0" w:semiHidden="0" w:name="Note Heading"/>
+    <w:lsdException w:unhideWhenUsed="0" w:uiPriority="0" w:semiHidden="0" w:name="Body Text 2"/>
+    <w:lsdException w:unhideWhenUsed="0" w:uiPriority="0" w:semiHidden="0" w:name="Body Text 3"/>
+    <w:lsdException w:unhideWhenUsed="0" w:uiPriority="0" w:semiHidden="0" w:name="Body Text Indent 2"/>
+    <w:lsdException w:unhideWhenUsed="0" w:uiPriority="0" w:semiHidden="0" w:name="Body Text Indent 3"/>
+    <w:lsdException w:unhideWhenUsed="0" w:uiPriority="0" w:semiHidden="0" w:name="Block Text"/>
+    <w:lsdException w:qFormat="1" w:unhideWhenUsed="0" w:uiPriority="99" w:semiHidden="0" w:name="Hyperlink"/>
+    <w:lsdException w:unhideWhenUsed="0" w:uiPriority="0" w:semiHidden="0" w:name="FollowedHyperlink"/>
+    <w:lsdException w:qFormat="1" w:unhideWhenUsed="0" w:uiPriority="0" w:semiHidden="0" w:name="Strong"/>
+    <w:lsdException w:qFormat="1" w:unhideWhenUsed="0" w:uiPriority="0" w:semiHidden="0" w:name="Emphasis"/>
+    <w:lsdException w:unhideWhenUsed="0" w:uiPriority="0" w:semiHidden="0" w:name="Document Map"/>
+    <w:lsdException w:unhideWhenUsed="0" w:uiPriority="0" w:semiHidden="0" w:name="Plain Text"/>
+    <w:lsdException w:unhideWhenUsed="0" w:uiPriority="0" w:semiHidden="0" w:name="E-mail Signature"/>
+    <w:lsdException w:unhideWhenUsed="0" w:uiPriority="0" w:semiHidden="0" w:name="Normal (Web)"/>
+    <w:lsdException w:unhideWhenUsed="0" w:uiPriority="0" w:semiHidden="0" w:name="HTML Acronym"/>
+    <w:lsdException w:unhideWhenUsed="0" w:uiPriority="0" w:semiHidden="0" w:name="HTML Address"/>
+    <w:lsdException w:unhideWhenUsed="0" w:uiPriority="0" w:semiHidden="0" w:name="HTML Cite"/>
+    <w:lsdException w:unhideWhenUsed="0" w:uiPriority="0" w:semiHidden="0" w:name="HTML Code"/>
+    <w:lsdException w:unhideWhenUsed="0" w:uiPriority="0" w:semiHidden="0" w:name="HTML Definition"/>
+    <w:lsdException w:unhideWhenUsed="0" w:uiPriority="0" w:semiHidden="0" w:name="HTML Keyboard"/>
+    <w:lsdException w:unhideWhenUsed="0" w:uiPriority="0" w:semiHidden="0" w:name="HTML Preformatted"/>
+    <w:lsdException w:unhideWhenUsed="0" w:uiPriority="0" w:semiHidden="0" w:name="HTML Sample"/>
+    <w:lsdException w:unhideWhenUsed="0" w:uiPriority="0" w:semiHidden="0" w:name="HTML Typewriter"/>
+    <w:lsdException w:unhideWhenUsed="0" w:uiPriority="0" w:semiHidden="0" w:name="HTML Variable"/>
+    <w:lsdException w:unhideWhenUsed="0" w:uiPriority="0" w:name="Normal Table"/>
+    <w:lsdException w:unhideWhenUsed="0" w:uiPriority="0" w:semiHidden="0" w:name="annotation subject"/>
+    <w:lsdException w:unhideWhenUsed="0" w:uiPriority="0" w:semiHidden="0" w:name="Table Simple 1"/>
+    <w:lsdException w:unhideWhenUsed="0" w:uiPriority="0" w:semiHidden="0" w:name="Table Simple 2"/>
+    <w:lsdException w:unhideWhenUsed="0" w:uiPriority="0" w:semiHidden="0" w:name="Table Simple 3"/>
+    <w:lsdException w:unhideWhenUsed="0" w:uiPriority="0" w:semiHidden="0" w:name="Table Classic 1"/>
+    <w:lsdException w:unhideWhenUsed="0" w:uiPriority="0" w:semiHidden="0" w:name="Table Classic 2"/>
+    <w:lsdException w:unhideWhenUsed="0" w:uiPriority="0" w:semiHidden="0" w:name="Table Classic 3"/>
+    <w:lsdException w:unhideWhenUsed="0" w:uiPriority="0" w:semiHidden="0" w:name="Table Classic 4"/>
+    <w:lsdException w:unhideWhenUsed="0" w:uiPriority="0" w:semiHidden="0" w:name="Table Colorful 1"/>
+    <w:lsdException w:unhideWhenUsed="0" w:uiPriority="0" w:semiHidden="0" w:name="Table Colorful 2"/>
+    <w:lsdException w:unhideWhenUsed="0" w:uiPriority="0" w:semiHidden="0" w:name="Table Colorful 3"/>
+    <w:lsdException w:unhideWhenUsed="0" w:uiPriority="0" w:semiHidden="0" w:name="Table Columns 1"/>
+    <w:lsdException w:unhideWhenUsed="0" w:uiPriority="0" w:semiHidden="0" w:name="Table Columns 2"/>
+    <w:lsdException w:unhideWhenUsed="0" w:uiPriority="0" w:semiHidden="0" w:name="Table Columns 3"/>
+    <w:lsdException w:unhideWhenUsed="0" w:uiPriority="0" w:semiHidden="0" w:name="Table Columns 4"/>
+    <w:lsdException w:unhideWhenUsed="0" w:uiPriority="0" w:semiHidden="0" w:name="Table Columns 5"/>
+    <w:lsdException w:unhideWhenUsed="0" w:uiPriority="0" w:semiHidden="0" w:name="Table Grid 1"/>
+    <w:lsdException w:unhideWhenUsed="0" w:uiPriority="0" w:semiHidden="0" w:name="Table Grid 2"/>
+    <w:lsdException w:unhideWhenUsed="0" w:uiPriority="0" w:semiHidden="0" w:name="Table Grid 3"/>
+    <w:lsdException w:unhideWhenUsed="0" w:uiPriority="0" w:semiHidden="0" w:name="Table Grid 4"/>
+    <w:lsdException w:unhideWhenUsed="0" w:uiPriority="0" w:semiHidden="0" w:name="Table Grid 5"/>
+    <w:lsdException w:unhideWhenUsed="0" w:uiPriority="0" w:semiHidden="0" w:name="Table Grid 6"/>
+    <w:lsdException w:unhideWhenUsed="0" w:uiPriority="0" w:semiHidden="0" w:name="Table Grid 7"/>
+    <w:lsdException w:unhideWhenUsed="0" w:uiPriority="0" w:semiHidden="0" w:name="Table Grid 8"/>
+    <w:lsdException w:unhideWhenUsed="0" w:uiPriority="0" w:semiHidden="0" w:name="Table List 1"/>
+    <w:lsdException w:unhideWhenUsed="0" w:uiPriority="0" w:semiHidden="0" w:name="Table List 2"/>
+    <w:lsdException w:unhideWhenUsed="0" w:uiPriority="0" w:semiHidden="0" w:name="Table List 3"/>
+    <w:lsdException w:unhideWhenUsed="0" w:uiPriority="0" w:semiHidden="0" w:name="Table List 4"/>
+    <w:lsdException w:unhideWhenUsed="0" w:uiPriority="0" w:semiHidden="0" w:name="Table List 5"/>
+    <w:lsdException w:unhideWhenUsed="0" w:uiPriority="0" w:semiHidden="0" w:name="Table List 6"/>
+    <w:lsdException w:unhideWhenUsed="0" w:uiPriority="0" w:semiHidden="0" w:name="Table List 7"/>
+    <w:lsdException w:unhideWhenUsed="0" w:uiPriority="0" w:semiHidden="0" w:name="Table List 8"/>
+    <w:lsdException w:unhideWhenUsed="0" w:uiPriority="0" w:semiHidden="0" w:name="Table 3D effects 1"/>
+    <w:lsdException w:unhideWhenUsed="0" w:uiPriority="0" w:semiHidden="0" w:name="Table 3D effects 2"/>
+    <w:lsdException w:unhideWhenUsed="0" w:uiPriority="0" w:semiHidden="0" w:name="Table 3D effects 3"/>
+    <w:lsdException w:unhideWhenUsed="0" w:uiPriority="0" w:semiHidden="0" w:name="Table Contemporary"/>
+    <w:lsdException w:unhideWhenUsed="0" w:uiPriority="0" w:semiHidden="0" w:name="Table Elegant"/>
+    <w:lsdException w:unhideWhenUsed="0" w:uiPriority="0" w:semiHidden="0" w:name="Table Professional"/>
+    <w:lsdException w:unhideWhenUsed="0" w:uiPriority="0" w:semiHidden="0" w:name="Table Subtle 1"/>
+    <w:lsdException w:unhideWhenUsed="0" w:uiPriority="0" w:semiHidden="0" w:name="Table Subtle 2"/>
+    <w:lsdException w:unhideWhenUsed="0" w:uiPriority="0" w:semiHidden="0" w:name="Table Web 1"/>
+    <w:lsdException w:unhideWhenUsed="0" w:uiPriority="0" w:semiHidden="0" w:name="Table Web 2"/>
+    <w:lsdException w:unhideWhenUsed="0" w:uiPriority="0" w:semiHidden="0" w:name="Table Web 3"/>
+    <w:lsdException w:unhideWhenUsed="0" w:uiPriority="0" w:semiHidden="0" w:name="Balloon Text"/>
+    <w:lsdException w:qFormat="1" w:unhideWhenUsed="0" w:uiPriority="59" w:semiHidden="0" w:name="Table Grid"/>
+    <w:lsdException w:unhideWhenUsed="0" w:uiPriority="0" w:semiHidden="0" w:name="Table Theme"/>
+    <w:lsdException w:unhideWhenUsed="0" w:uiPriority="60" w:semiHidden="0" w:name="Light Shading"/>
+    <w:lsdException w:unhideWhenUsed="0" w:uiPriority="61" w:semiHidden="0" w:name="Light List"/>
+    <w:lsdException w:unhideWhenUsed="0" w:uiPriority="62" w:semiHidden="0" w:name="Light Grid"/>
+    <w:lsdException w:unhideWhenUsed="0" w:uiPriority="63" w:semiHidden="0" w:name="Medium Shading 1"/>
+    <w:lsdException w:unhideWhenUsed="0" w:uiPriority="64" w:semiHidden="0" w:name="Medium Shading 2"/>
+    <w:lsdException w:unhideWhenUsed="0" w:uiPriority="65" w:semiHidden="0" w:name="Medium List 1"/>
+    <w:lsdException w:unhideWhenUsed="0" w:uiPriority="66" w:semiHidden="0" w:name="Medium List 2"/>
+    <w:lsdException w:unhideWhenUsed="0" w:uiPriority="67" w:semiHidden="0" w:name="Medium Grid 1"/>
+    <w:lsdException w:unhideWhenUsed="0" w:uiPriority="68" w:semiHidden="0" w:name="Medium Grid 2"/>
+    <w:lsdException w:unhideWhenUsed="0" w:uiPriority="69" w:semiHidden="0" w:name="Medium Grid 3"/>
+    <w:lsdException w:unhideWhenUsed="0" w:uiPriority="70" w:semiHidden="0" w:name="Dark List"/>
+    <w:lsdException w:unhideWhenUsed="0" w:uiPriority="71" w:semiHidden="0" w:name="Colorful Shading"/>
+    <w:lsdException w:unhideWhenUsed="0" w:uiPriority="72" w:semiHidden="0" w:name="Colorful List"/>
+    <w:lsdException w:unhideWhenUsed="0" w:uiPriority="73" w:semiHidden="0" w:name="Colorful Grid"/>
+    <w:lsdException w:unhideWhenUsed="0" w:uiPriority="60" w:semiHidden="0" w:name="Light Shading Accent 1"/>
+    <w:lsdException w:unhideWhenUsed="0" w:uiPriority="61" w:semiHidden="0" w:name="Light List Accent 1"/>
+    <w:lsdException w:unhideWhenUsed="0" w:uiPriority="62" w:semiHidden="0" w:name="Light Grid Accent 1"/>
+    <w:lsdException w:unhideWhenUsed="0" w:uiPriority="63" w:semiHidden="0" w:name="Medium Shading 1 Accent 1"/>
+    <w:lsdException w:unhideWhenUsed="0" w:uiPriority="64" w:semiHidden="0" w:name="Medium Shading 2 Accent 1"/>
+    <w:lsdException w:unhideWhenUsed="0" w:uiPriority="65" w:semiHidden="0" w:name="Medium List 1 Accent 1"/>
+    <w:lsdException w:unhideWhenUsed="0" w:uiPriority="66" w:semiHidden="0" w:name="Medium List 2 Accent 1"/>
+    <w:lsdException w:unhideWhenUsed="0" w:uiPriority="67" w:semiHidden="0" w:name="Medium Grid 1 Accent 1"/>
+    <w:lsdException w:unhideWhenUsed="0" w:uiPriority="68" w:semiHidden="0" w:name="Medium Grid 2 Accent 1"/>
+    <w:lsdException w:unhideWhenUsed="0" w:uiPriority="69" w:semiHidden="0" w:name="Medium Grid 3 Accent 1"/>
+    <w:lsdException w:unhideWhenUsed="0" w:uiPriority="70" w:semiHidden="0" w:name="Dark List Accent 1"/>
+    <w:lsdException w:unhideWhenUsed="0" w:uiPriority="71" w:semiHidden="0" w:name="Colorful Shading Accent 1"/>
+    <w:lsdException w:unhideWhenUsed="0" w:uiPriority="72" w:semiHidden="0" w:name="Colorful List Accent 1"/>
+    <w:lsdException w:unhideWhenUsed="0" w:uiPriority="73" w:semiHidden="0" w:name="Colorful Grid Accent 1"/>
+    <w:lsdException w:unhideWhenUsed="0" w:uiPriority="60" w:semiHidden="0" w:name="Light Shading Accent 2"/>
+    <w:lsdException w:unhideWhenUsed="0" w:uiPriority="61" w:semiHidden="0" w:name="Light List Accent 2"/>
+    <w:lsdException w:unhideWhenUsed="0" w:uiPriority="62" w:semiHidden="0" w:name="Light Grid Accent 2"/>
+    <w:lsdException w:unhideWhenUsed="0" w:uiPriority="63" w:semiHidden="0" w:name="Medium Shading 1 Accent 2"/>
+    <w:lsdException w:unhideWhenUsed="0" w:uiPriority="64" w:semiHidden="0" w:name="Medium Shading 2 Accent 2"/>
+    <w:lsdException w:unhideWhenUsed="0" w:uiPriority="65" w:semiHidden="0" w:name="Medium List 1 Accent 2"/>
+    <w:lsdException w:unhideWhenUsed="0" w:uiPriority="66" w:semiHidden="0" w:name="Medium List 2 Accent 2"/>
+    <w:lsdException w:unhideWhenUsed="0" w:uiPriority="67" w:semiHidden="0" w:name="Medium Grid 1 Accent 2"/>
+    <w:lsdException w:unhideWhenUsed="0" w:uiPriority="68" w:semiHidden="0" w:name="Medium Grid 2 Accent 2"/>
+    <w:lsdException w:unhideWhenUsed="0" w:uiPriority="69" w:semiHidden="0" w:name="Medium Grid 3 Accent 2"/>
+    <w:lsdException w:unhideWhenUsed="0" w:uiPriority="70" w:semiHidden="0" w:name="Dark List Accent 2"/>
+    <w:lsdException w:unhideWhenUsed="0" w:uiPriority="71" w:semiHidden="0" w:name="Colorful Shading Accent 2"/>
+    <w:lsdException w:unhideWhenUsed="0" w:uiPriority="72" w:semiHidden="0" w:name="Colorful List Accent 2"/>
+    <w:lsdException w:unhideWhenUsed="0" w:uiPriority="73" w:semiHidden="0" w:name="Colorful Grid Accent 2"/>
+    <w:lsdException w:unhideWhenUsed="0" w:uiPriority="60" w:semiHidden="0" w:name="Light Shading Accent 3"/>
+    <w:lsdException w:unhideWhenUsed="0" w:uiPriority="61" w:semiHidden="0" w:name="Light List Accent 3"/>
+    <w:lsdException w:unhideWhenUsed="0" w:uiPriority="62" w:semiHidden="0" w:name="Light Grid Accent 3"/>
+    <w:lsdException w:unhideWhenUsed="0" w:uiPriority="63" w:semiHidden="0" w:name="Medium Shading 1 Accent 3"/>
+    <w:lsdException w:unhideWhenUsed="0" w:uiPriority="64" w:semiHidden="0" w:name="Medium Shading 2 Accent 3"/>
+    <w:lsdException w:unhideWhenUsed="0" w:uiPriority="65" w:semiHidden="0" w:name="Medium List 1 Accent 3"/>
+    <w:lsdException w:unhideWhenUsed="0" w:uiPriority="66" w:semiHidden="0" w:name="Medium List 2 Accent 3"/>
+    <w:lsdException w:unhideWhenUsed="0" w:uiPriority="67" w:semiHidden="0" w:name="Medium Grid 1 Accent 3"/>
+    <w:lsdException w:unhideWhenUsed="0" w:uiPriority="68" w:semiHidden="0" w:name="Medium Grid 2 Accent 3"/>
+    <w:lsdException w:unhideWhenUsed="0" w:uiPriority="69" w:semiHidden="0" w:name="Medium Grid 3 Accent 3"/>
+    <w:lsdException w:unhideWhenUsed="0" w:uiPriority="70" w:semiHidden="0" w:name="Dark List Accent 3"/>
+    <w:lsdException w:unhideWhenUsed="0" w:uiPriority="71" w:semiHidden="0" w:name="Colorful Shading Accent 3"/>
+    <w:lsdException w:unhideWhenUsed="0" w:uiPriority="72" w:semiHidden="0" w:name="Colorful List Accent 3"/>
+    <w:lsdException w:unhideWhenUsed="0" w:uiPriority="73" w:semiHidden="0" w:name="Colorful Grid Accent 3"/>
+    <w:lsdException w:unhideWhenUsed="0" w:uiPriority="60" w:semiHidden="0" w:name="Light Shading Accent 4"/>
+    <w:lsdException w:unhideWhenUsed="0" w:uiPriority="61" w:semiHidden="0" w:name="Light List Accent 4"/>
+    <w:lsdException w:unhideWhenUsed="0" w:uiPriority="62" w:semiHidden="0" w:name="Light Grid Accent 4"/>
+    <w:lsdException w:unhideWhenUsed="0" w:uiPriority="63" w:semiHidden="0" w:name="Medium Shading 1 Accent 4"/>
+    <w:lsdException w:unhideWhenUsed="0" w:uiPriority="64" w:semiHidden="0" w:name="Medium Shading 2 Accent 4"/>
+    <w:lsdException w:unhideWhenUsed="0" w:uiPriority="65" w:semiHidden="0" w:name="Medium List 1 Accent 4"/>
+    <w:lsdException w:unhideWhenUsed="0" w:uiPriority="66" w:semiHidden="0" w:name="Medium List 2 Accent 4"/>
+    <w:lsdException w:unhideWhenUsed="0" w:uiPriority="67" w:semiHidden="0" w:name="Medium Grid 1 Accent 4"/>
+    <w:lsdException w:unhideWhenUsed="0" w:uiPriority="68" w:semiHidden="0" w:name="Medium Grid 2 Accent 4"/>
+    <w:lsdException w:unhideWhenUsed="0" w:uiPriority="69" w:semiHidden="0" w:name="Medium Grid 3 Accent 4"/>
+    <w:lsdException w:unhideWhenUsed="0" w:uiPriority="70" w:semiHidden="0" w:name="Dark List Accent 4"/>
+    <w:lsdException w:unhideWhenUsed="0" w:uiPriority="71" w:semiHidden="0" w:name="Colorful Shading Accent 4"/>
+    <w:lsdException w:unhideWhenUsed="0" w:uiPriority="72" w:semiHidden="0" w:name="Colorful List Accent 4"/>
+    <w:lsdException w:unhideWhenUsed="0" w:uiPriority="73" w:semiHidden="0" w:name="Colorful Grid Accent 4"/>
+    <w:lsdException w:unhideWhenUsed="0" w:uiPriority="60" w:semiHidden="0" w:name="Light Shading Accent 5"/>
+    <w:lsdException w:unhideWhenUsed="0" w:uiPriority="61" w:semiHidden="0" w:name="Light List Accent 5"/>
+    <w:lsdException w:unhideWhenUsed="0" w:uiPriority="62" w:semiHidden="0" w:name="Light Grid Accent 5"/>
+    <w:lsdException w:unhideWhenUsed="0" w:uiPriority="63" w:semiHidden="0" w:name="Medium Shading 1 Accent 5"/>
+    <w:lsdException w:unhideWhenUsed="0" w:uiPriority="64" w:semiHidden="0" w:name="Medium Shading 2 Accent 5"/>
+    <w:lsdException w:unhideWhenUsed="0" w:uiPriority="65" w:semiHidden="0" w:name="Medium List 1 Accent 5"/>
+    <w:lsdException w:unhideWhenUsed="0" w:uiPriority="66" w:semiHidden="0" w:name="Medium List 2 Accent 5"/>
+    <w:lsdException w:unhideWhenUsed="0" w:uiPriority="67" w:semiHidden="0" w:name="Medium Grid 1 Accent 5"/>
+    <w:lsdException w:unhideWhenUsed="0" w:uiPriority="68" w:semiHidden="0" w:name="Medium Grid 2 Accent 5"/>
+    <w:lsdException w:unhideWhenUsed="0" w:uiPriority="69" w:semiHidden="0" w:name="Medium Grid 3 Accent 5"/>
+    <w:lsdException w:unhideWhenUsed="0" w:uiPriority="70" w:semiHidden="0" w:name="Dark List Accent 5"/>
+    <w:lsdException w:unhideWhenUsed="0" w:uiPriority="71" w:semiHidden="0" w:name="Colorful Shading Accent 5"/>
+    <w:lsdException w:unhideWhenUsed="0" w:uiPriority="72" w:semiHidden="0" w:name="Colorful List Accent 5"/>
+    <w:lsdException w:unhideWhenUsed="0" w:uiPriority="73" w:semiHidden="0" w:name="Colorful Grid Accent 5"/>
+    <w:lsdException w:unhideWhenUsed="0" w:uiPriority="60" w:semiHidden="0" w:name="Light Shading Accent 6"/>
+    <w:lsdException w:unhideWhenUsed="0" w:uiPriority="61" w:semiHidden="0" w:name="Light List Accent 6"/>
+    <w:lsdException w:unhideWhenUsed="0" w:uiPriority="62" w:semiHidden="0" w:name="Light Grid Accent 6"/>
+    <w:lsdException w:unhideWhenUsed="0" w:uiPriority="63" w:semiHidden="0" w:name="Medium Shading 1 Accent 6"/>
+    <w:lsdException w:unhideWhenUsed="0" w:uiPriority="64" w:semiHidden="0" w:name="Medium Shading 2 Accent 6"/>
+    <w:lsdException w:unhideWhenUsed="0" w:uiPriority="65" w:semiHidden="0" w:name="Medium List 1 Accent 6"/>
+    <w:lsdException w:unhideWhenUsed="0" w:uiPriority="66" w:semiHidden="0" w:name="Medium List 2 Accent 6"/>
+    <w:lsdException w:unhideWhenUsed="0" w:uiPriority="67" w:semiHidden="0" w:name="Medium Grid 1 Accent 6"/>
+    <w:lsdException w:unhideWhenUsed="0" w:uiPriority="68" w:semiHidden="0" w:name="Medium Grid 2 Accent 6"/>
+    <w:lsdException w:unhideWhenUsed="0" w:uiPriority="69" w:semiHidden="0" w:name="Medium Grid 3 Accent 6"/>
+    <w:lsdException w:unhideWhenUsed="0" w:uiPriority="70" w:semiHidden="0" w:name="Dark List Accent 6"/>
+    <w:lsdException w:unhideWhenUsed="0" w:uiPriority="71" w:semiHidden="0" w:name="Colorful Shading Accent 6"/>
+    <w:lsdException w:unhideWhenUsed="0" w:uiPriority="72" w:semiHidden="0" w:name="Colorful List Accent 6"/>
+    <w:lsdException w:unhideWhenUsed="0" w:uiPriority="73" w:semiHidden="0" w:name="Colorful Grid Accent 6"/>
+  </w:latentStyles>
+  <w:style w:type="paragraph" w:default="1" w:styleId="1">
     <w:name w:val="Normal"/>
+    <w:qFormat/>
     <w:uiPriority w:val="0"/>
-    <w:qFormat/>
     <w:pPr>
       <w:spacing w:line="360" w:lineRule="auto"/>
       <w:ind w:firstLine="480"/>
@@ -1892,80 +2215,12 @@
       <w:szCs w:val="24"/>
     </w:rPr>
   </w:style>
-  <w:style w:type="paragraph" w:styleId="3" w:customStyle="1">
-    <w:name w:val="正文"/>
-    <w:basedOn w:val="1"/>
-    <w:uiPriority w:val="1"/>
-    <w:qFormat/>
-    <w:pPr>
-      <w:spacing w:line="360" w:lineRule="auto"/>
-      <w:ind w:firstLine="480"/>
-      <w:jc w:val="both"/>
-    </w:pPr>
-    <w:rPr>
-      <w:rFonts w:ascii="Times New Roman" w:hAnsi="Times New Roman" w:eastAsia="宋体" w:cs="Times New Roman"/>
-      <w:sz w:val="24"/>
-      <w:szCs w:val="24"/>
-    </w:rPr>
-  </w:style>
-  <w:style w:type="paragraph" w:styleId="88" w:customStyle="1">
-    <w:name w:val="封面-项目名称"/>
-    <w:basedOn w:val="1"/>
-    <w:uiPriority w:val="2"/>
-    <w:qFormat/>
-    <w:pPr>
-      <w:spacing w:line="800" w:lineRule="auto"/>
-      <w:ind w:firstLine="0"/>
-      <w:jc w:val="center"/>
-    </w:pPr>
-    <w:rPr>
-      <w:rFonts w:ascii="黑体" w:hAnsi="黑体" w:eastAsia="黑体" w:cs="黑体"/>
-      <w:b/>
-      <w:bCs/>
-      <w:sz w:val="52"/>
-      <w:szCs w:val="52"/>
-    </w:rPr>
-  </w:style>
-  <w:style w:type="paragraph" w:styleId="TJCoverSubtitle" w:customStyle="1">
-    <w:name w:val="封面-副标题"/>
-    <w:basedOn w:val="1"/>
-    <w:uiPriority w:val="3"/>
-    <w:qFormat/>
-    <w:pPr>
-      <w:spacing w:line="420" w:lineRule="auto"/>
-      <w:ind w:firstLine="0"/>
-      <w:jc w:val="center"/>
-    </w:pPr>
-    <w:rPr>
-      <w:rFonts w:ascii="黑体" w:hAnsi="黑体" w:eastAsia="黑体" w:cs="黑体"/>
-      <w:b/>
-      <w:bCs/>
-      <w:sz w:val="32"/>
-      <w:szCs w:val="32"/>
-    </w:rPr>
-  </w:style>
-  <w:style w:type="paragraph" w:styleId="TJCoverMeta" w:customStyle="1">
-    <w:name w:val="封面-信息项"/>
-    <w:basedOn w:val="1"/>
-    <w:uiPriority w:val="4"/>
-    <w:qFormat/>
-    <w:pPr>
-      <w:spacing w:line="360" w:lineRule="auto"/>
-      <w:ind w:firstLine="0"/>
-      <w:jc w:val="left"/>
-    </w:pPr>
-    <w:rPr>
-      <w:rFonts w:ascii="Times New Roman" w:hAnsi="Times New Roman" w:eastAsia="宋体" w:cs="Times New Roman"/>
-      <w:sz w:val="28"/>
-      <w:szCs w:val="28"/>
-    </w:rPr>
-  </w:style>
   <w:style w:type="paragraph" w:styleId="2">
     <w:name w:val="heading 1"/>
     <w:basedOn w:val="1"/>
     <w:next w:val="3"/>
+    <w:qFormat/>
     <w:uiPriority w:val="9"/>
-    <w:qFormat/>
     <w:pPr>
       <w:keepNext/>
       <w:keepLines/>
@@ -1990,8 +2245,8 @@
     <w:name w:val="heading 2"/>
     <w:basedOn w:val="1"/>
     <w:next w:val="3"/>
+    <w:qFormat/>
     <w:uiPriority w:val="9"/>
-    <w:qFormat/>
     <w:pPr>
       <w:keepNext/>
       <w:keepLines/>
@@ -2016,8 +2271,8 @@
     <w:name w:val="heading 3"/>
     <w:basedOn w:val="1"/>
     <w:next w:val="3"/>
+    <w:qFormat/>
     <w:uiPriority w:val="9"/>
-    <w:qFormat/>
     <w:pPr>
       <w:keepNext/>
       <w:keepLines/>
@@ -2042,8 +2297,8 @@
     <w:name w:val="heading 4"/>
     <w:basedOn w:val="1"/>
     <w:next w:val="3"/>
+    <w:qFormat/>
     <w:uiPriority w:val="9"/>
-    <w:qFormat/>
     <w:pPr>
       <w:keepNext/>
       <w:keepLines/>
@@ -2068,8 +2323,8 @@
     <w:name w:val="heading 5"/>
     <w:basedOn w:val="1"/>
     <w:next w:val="3"/>
+    <w:qFormat/>
     <w:uiPriority w:val="9"/>
-    <w:qFormat/>
     <w:pPr>
       <w:keepNext/>
       <w:keepLines/>
@@ -2094,8 +2349,8 @@
     <w:name w:val="heading 6"/>
     <w:basedOn w:val="1"/>
     <w:next w:val="3"/>
+    <w:qFormat/>
     <w:uiPriority w:val="9"/>
-    <w:qFormat/>
     <w:pPr>
       <w:keepNext/>
       <w:keepLines/>
@@ -2120,8 +2375,8 @@
     <w:name w:val="heading 7"/>
     <w:basedOn w:val="1"/>
     <w:next w:val="3"/>
+    <w:qFormat/>
     <w:uiPriority w:val="9"/>
-    <w:qFormat/>
     <w:pPr>
       <w:keepNext/>
       <w:keepLines/>
@@ -2142,27 +2397,41 @@
       <w:szCs w:val="24"/>
     </w:rPr>
   </w:style>
-  <w:style w:type="paragraph" w:styleId="86" w:customStyle="1">
-    <w:name w:val="目录标题"/>
+  <w:style w:type="character" w:default="1" w:styleId="19">
+    <w:name w:val="Default Paragraph Font"/>
+    <w:uiPriority w:val="99"/>
+  </w:style>
+  <w:style w:type="table" w:default="1" w:styleId="17">
+    <w:name w:val="Normal Table"/>
+    <w:semiHidden/>
+    <w:uiPriority w:val="0"/>
+    <w:tblPr>
+      <w:tblCellMar>
+        <w:top w:w="0" w:type="dxa"/>
+        <w:left w:w="108" w:type="dxa"/>
+        <w:bottom w:w="0" w:type="dxa"/>
+        <w:right w:w="108" w:type="dxa"/>
+      </w:tblCellMar>
+    </w:tblPr>
+  </w:style>
+  <w:style w:type="paragraph" w:customStyle="1" w:styleId="3">
+    <w:name w:val="正文1"/>
     <w:basedOn w:val="1"/>
-    <w:uiPriority w:val="10"/>
     <w:qFormat/>
-    <w:pPr>
-      <w:spacing w:before="240" w:after="240" w:line="360" w:lineRule="auto"/>
-      <w:ind w:firstLine="0"/>
-      <w:jc w:val="center"/>
-      <w:outlineLvl w:val="9"/>
+    <w:uiPriority w:val="1"/>
+    <w:pPr>
+      <w:spacing w:line="360" w:lineRule="auto"/>
+      <w:ind w:firstLine="480"/>
+      <w:jc w:val="both"/>
     </w:pPr>
     <w:rPr>
-      <w:rFonts w:ascii="Times New Roman" w:hAnsi="Times New Roman" w:eastAsia="黑体" w:cs="Times New Roman"/>
-      <w:b/>
-      <w:bCs/>
-      <w:sz w:val="32"/>
-      <w:szCs w:val="32"/>
+      <w:rFonts w:ascii="Times New Roman" w:hAnsi="Times New Roman" w:eastAsia="宋体" w:cs="Times New Roman"/>
+      <w:sz w:val="24"/>
+      <w:szCs w:val="24"/>
     </w:rPr>
   </w:style>
-  <w:style w:type="paragraph" w:styleId="32">
-    <w:name w:val="toc 1"/>
+  <w:style w:type="paragraph" w:styleId="10">
+    <w:name w:val="toc 7"/>
     <w:basedOn w:val="1"/>
     <w:next w:val="1"/>
     <w:uiPriority w:val="39"/>
@@ -2171,45 +2440,7 @@
         <w:tab w:val="right" w:leader="dot" w:pos="8306"/>
       </w:tabs>
       <w:spacing w:line="300" w:lineRule="auto"/>
-      <w:ind w:firstLine="0" w:left="0"/>
-      <w:jc w:val="left"/>
-    </w:pPr>
-    <w:rPr>
-      <w:rFonts w:ascii="Times New Roman" w:hAnsi="Times New Roman" w:eastAsia="宋体" w:cs="Times New Roman"/>
-      <w:sz w:val="22"/>
-      <w:szCs w:val="22"/>
-    </w:rPr>
-  </w:style>
-  <w:style w:type="paragraph" w:styleId="39">
-    <w:name w:val="toc 2"/>
-    <w:basedOn w:val="1"/>
-    <w:next w:val="1"/>
-    <w:uiPriority w:val="39"/>
-    <w:pPr>
-      <w:tabs>
-        <w:tab w:val="right" w:leader="dot" w:pos="8306"/>
-      </w:tabs>
-      <w:spacing w:line="300" w:lineRule="auto"/>
-      <w:ind w:firstLine="0" w:left="420"/>
-      <w:jc w:val="left"/>
-    </w:pPr>
-    <w:rPr>
-      <w:rFonts w:ascii="Times New Roman" w:hAnsi="Times New Roman" w:eastAsia="宋体" w:cs="Times New Roman"/>
-      <w:sz w:val="22"/>
-      <w:szCs w:val="22"/>
-    </w:rPr>
-  </w:style>
-  <w:style w:type="paragraph" w:styleId="23">
-    <w:name w:val="toc 3"/>
-    <w:basedOn w:val="1"/>
-    <w:next w:val="1"/>
-    <w:uiPriority w:val="39"/>
-    <w:pPr>
-      <w:tabs>
-        <w:tab w:val="right" w:leader="dot" w:pos="8306"/>
-      </w:tabs>
-      <w:spacing w:line="300" w:lineRule="auto"/>
-      <w:ind w:firstLine="0" w:left="840"/>
+      <w:ind w:left="2520" w:firstLine="0"/>
       <w:jc w:val="left"/>
     </w:pPr>
     <w:rPr>
@@ -2218,8 +2449,8 @@
       <w:szCs w:val="21"/>
     </w:rPr>
   </w:style>
-  <w:style w:type="paragraph" w:styleId="33">
-    <w:name w:val="toc 4"/>
+  <w:style w:type="paragraph" w:styleId="11">
+    <w:name w:val="toc 5"/>
     <w:basedOn w:val="1"/>
     <w:next w:val="1"/>
     <w:uiPriority w:val="39"/>
@@ -2228,7 +2459,7 @@
         <w:tab w:val="right" w:leader="dot" w:pos="8306"/>
       </w:tabs>
       <w:spacing w:line="300" w:lineRule="auto"/>
-      <w:ind w:firstLine="0" w:left="1260"/>
+      <w:ind w:left="1680" w:firstLine="0"/>
       <w:jc w:val="left"/>
     </w:pPr>
     <w:rPr>
@@ -2237,8 +2468,8 @@
       <w:szCs w:val="21"/>
     </w:rPr>
   </w:style>
-  <w:style w:type="paragraph" w:styleId="22">
-    <w:name w:val="toc 5"/>
+  <w:style w:type="paragraph" w:styleId="12">
+    <w:name w:val="toc 3"/>
     <w:basedOn w:val="1"/>
     <w:next w:val="1"/>
     <w:uiPriority w:val="39"/>
@@ -2247,26 +2478,7 @@
         <w:tab w:val="right" w:leader="dot" w:pos="8306"/>
       </w:tabs>
       <w:spacing w:line="300" w:lineRule="auto"/>
-      <w:ind w:firstLine="0" w:left="1680"/>
-      <w:jc w:val="left"/>
-    </w:pPr>
-    <w:rPr>
-      <w:rFonts w:ascii="Times New Roman" w:hAnsi="Times New Roman" w:eastAsia="宋体" w:cs="Times New Roman"/>
-      <w:sz w:val="21"/>
-      <w:szCs w:val="21"/>
-    </w:rPr>
-  </w:style>
-  <w:style w:type="paragraph" w:styleId="36">
-    <w:name w:val="toc 6"/>
-    <w:basedOn w:val="1"/>
-    <w:next w:val="1"/>
-    <w:uiPriority w:val="39"/>
-    <w:pPr>
-      <w:tabs>
-        <w:tab w:val="right" w:leader="dot" w:pos="8306"/>
-      </w:tabs>
-      <w:spacing w:line="300" w:lineRule="auto"/>
-      <w:ind w:firstLine="0" w:left="2100"/>
+      <w:ind w:left="840" w:firstLine="0"/>
       <w:jc w:val="left"/>
     </w:pPr>
     <w:rPr>
@@ -2276,7 +2488,7 @@
     </w:rPr>
   </w:style>
   <w:style w:type="paragraph" w:styleId="13">
-    <w:name w:val="toc 7"/>
+    <w:name w:val="toc 1"/>
     <w:basedOn w:val="1"/>
     <w:next w:val="1"/>
     <w:uiPriority w:val="39"/>
@@ -2285,7 +2497,26 @@
         <w:tab w:val="right" w:leader="dot" w:pos="8306"/>
       </w:tabs>
       <w:spacing w:line="300" w:lineRule="auto"/>
-      <w:ind w:firstLine="0" w:left="2520"/>
+      <w:ind w:left="0" w:firstLine="0"/>
+      <w:jc w:val="left"/>
+    </w:pPr>
+    <w:rPr>
+      <w:rFonts w:ascii="Times New Roman" w:hAnsi="Times New Roman" w:eastAsia="宋体" w:cs="Times New Roman"/>
+      <w:sz w:val="22"/>
+      <w:szCs w:val="22"/>
+    </w:rPr>
+  </w:style>
+  <w:style w:type="paragraph" w:styleId="14">
+    <w:name w:val="toc 4"/>
+    <w:basedOn w:val="1"/>
+    <w:next w:val="1"/>
+    <w:uiPriority w:val="39"/>
+    <w:pPr>
+      <w:tabs>
+        <w:tab w:val="right" w:leader="dot" w:pos="8306"/>
+      </w:tabs>
+      <w:spacing w:line="300" w:lineRule="auto"/>
+      <w:ind w:left="1260" w:firstLine="0"/>
       <w:jc w:val="left"/>
     </w:pPr>
     <w:rPr>
@@ -2294,48 +2525,17 @@
       <w:szCs w:val="21"/>
     </w:rPr>
   </w:style>
-  <w:style w:type="paragraph" w:styleId="110" w:customStyle="1">
-    <w:name w:val="题注"/>
+  <w:style w:type="paragraph" w:styleId="15">
+    <w:name w:val="toc 6"/>
     <w:basedOn w:val="1"/>
-    <w:uiPriority w:val="11"/>
-    <w:qFormat/>
-    <w:pPr>
-      <w:spacing w:before="120" w:after="120" w:line="300" w:lineRule="auto"/>
-      <w:ind w:firstLine="0"/>
-      <w:jc w:val="center"/>
-    </w:pPr>
-    <w:rPr>
-      <w:rFonts w:ascii="Times New Roman" w:hAnsi="Times New Roman" w:eastAsia="黑体" w:cs="Times New Roman"/>
-      <w:sz w:val="21"/>
-      <w:szCs w:val="21"/>
-    </w:rPr>
-  </w:style>
-  <w:style w:type="paragraph" w:styleId="TJTableHeader" w:customStyle="1">
-    <w:name w:val="表格-表头"/>
-    <w:basedOn w:val="1"/>
-    <w:uiPriority w:val="12"/>
-    <w:qFormat/>
-    <w:pPr>
+    <w:next w:val="1"/>
+    <w:uiPriority w:val="39"/>
+    <w:pPr>
+      <w:tabs>
+        <w:tab w:val="right" w:leader="dot" w:pos="8306"/>
+      </w:tabs>
       <w:spacing w:line="300" w:lineRule="auto"/>
-      <w:ind w:firstLine="0"/>
-      <w:jc w:val="center"/>
-    </w:pPr>
-    <w:rPr>
-      <w:rFonts w:ascii="Times New Roman" w:hAnsi="Times New Roman" w:eastAsia="黑体" w:cs="Times New Roman"/>
-      <w:b/>
-      <w:bCs/>
-      <w:sz w:val="21"/>
-      <w:szCs w:val="21"/>
-    </w:rPr>
-  </w:style>
-  <w:style w:type="paragraph" w:styleId="TJTableLeft" w:customStyle="1">
-    <w:name w:val="表格-正文左对齐"/>
-    <w:basedOn w:val="1"/>
-    <w:uiPriority w:val="13"/>
-    <w:qFormat/>
-    <w:pPr>
-      <w:spacing w:line="300" w:lineRule="auto"/>
-      <w:ind w:firstLine="0"/>
+      <w:ind w:left="2100" w:firstLine="0"/>
       <w:jc w:val="left"/>
     </w:pPr>
     <w:rPr>
@@ -2344,105 +2544,29 @@
       <w:szCs w:val="21"/>
     </w:rPr>
   </w:style>
-  <w:style w:type="paragraph" w:styleId="TJTableCenter" w:customStyle="1">
-    <w:name w:val="表格-正文居中"/>
+  <w:style w:type="paragraph" w:styleId="16">
+    <w:name w:val="toc 2"/>
     <w:basedOn w:val="1"/>
-    <w:uiPriority w:val="14"/>
-    <w:qFormat/>
-    <w:pPr>
+    <w:next w:val="1"/>
+    <w:uiPriority w:val="39"/>
+    <w:pPr>
+      <w:tabs>
+        <w:tab w:val="right" w:leader="dot" w:pos="8306"/>
+      </w:tabs>
       <w:spacing w:line="300" w:lineRule="auto"/>
-      <w:ind w:firstLine="0"/>
-      <w:jc w:val="center"/>
+      <w:ind w:left="420" w:firstLine="0"/>
+      <w:jc w:val="left"/>
     </w:pPr>
     <w:rPr>
       <w:rFonts w:ascii="Times New Roman" w:hAnsi="Times New Roman" w:eastAsia="宋体" w:cs="Times New Roman"/>
-      <w:sz w:val="21"/>
-      <w:szCs w:val="21"/>
+      <w:sz w:val="22"/>
+      <w:szCs w:val="22"/>
     </w:rPr>
   </w:style>
-  <w:style w:type="paragraph" w:styleId="TJTableRight" w:customStyle="1">
-    <w:name w:val="表格-数字右对齐"/>
-    <w:basedOn w:val="1"/>
-    <w:uiPriority w:val="15"/>
+  <w:style w:type="table" w:styleId="18">
+    <w:name w:val="Table Grid"/>
     <w:qFormat/>
-    <w:pPr>
-      <w:spacing w:line="300" w:lineRule="auto"/>
-      <w:ind w:firstLine="0"/>
-      <w:jc w:val="right"/>
-    </w:pPr>
-    <w:rPr>
-      <w:rFonts w:ascii="Times New Roman" w:hAnsi="Times New Roman" w:eastAsia="宋体" w:cs="Times New Roman"/>
-      <w:sz w:val="21"/>
-      <w:szCs w:val="21"/>
-    </w:rPr>
-  </w:style>
-  <w:style w:type="paragraph" w:styleId="TJFigurePlaceholder" w:customStyle="1">
-    <w:name w:val="图片占位说明"/>
-    <w:basedOn w:val="1"/>
-    <w:uiPriority w:val="16"/>
-    <w:qFormat/>
-    <w:pPr>
-      <w:spacing w:line="300" w:lineRule="auto"/>
-      <w:ind w:firstLine="0"/>
-      <w:jc w:val="center"/>
-    </w:pPr>
-    <w:rPr>
-      <w:rFonts w:ascii="Times New Roman" w:hAnsi="Times New Roman" w:eastAsia="宋体" w:cs="Times New Roman"/>
-      <w:color w:val="666666"/>
-      <w:sz w:val="21"/>
-      <w:szCs w:val="21"/>
-    </w:rPr>
-  </w:style>
-  <w:style w:type="paragraph" w:styleId="30">
-    <w:name w:val="页脚"/>
-    <w:basedOn w:val="1"/>
-    <w:uiPriority w:val="99"/>
-    <w:pPr>
-      <w:spacing w:line="240" w:lineRule="auto"/>
-      <w:ind w:firstLine="0"/>
-      <w:jc w:val="center"/>
-    </w:pPr>
-    <w:rPr>
-      <w:rFonts w:ascii="Times New Roman" w:hAnsi="Times New Roman" w:eastAsia="宋体" w:cs="Times New Roman"/>
-      <w:sz w:val="18"/>
-      <w:szCs w:val="18"/>
-    </w:rPr>
-  </w:style>
-  <w:style w:type="paragraph" w:styleId="31">
-    <w:name w:val="页眉"/>
-    <w:basedOn w:val="1"/>
-    <w:uiPriority w:val="99"/>
-    <w:pPr>
-      <w:spacing w:line="240" w:lineRule="auto"/>
-      <w:ind w:firstLine="0"/>
-      <w:jc w:val="left"/>
-    </w:pPr>
-    <w:rPr>
-      <w:rFonts w:ascii="Times New Roman" w:hAnsi="Times New Roman" w:eastAsia="宋体" w:cs="Times New Roman"/>
-      <w:sz w:val="18"/>
-      <w:szCs w:val="18"/>
-    </w:rPr>
-  </w:style>
-  <w:style w:type="character" w:styleId="55" w:default="1">
-    <w:name w:val="Default Paragraph Font"/>
-    <w:uiPriority w:val="99"/>
-  </w:style>
-  <w:style w:type="character" w:styleId="62">
-    <w:name w:val="Hyperlink"/>
-    <w:uiPriority w:val="99"/>
-    <w:qFormat/>
-    <w:rPr>
-      <w:rFonts w:ascii="Times New Roman" w:hAnsi="Times New Roman" w:eastAsia="宋体" w:cs="Times New Roman"/>
-      <w:color w:val="0563C1"/>
-      <w:sz w:val="24"/>
-      <w:szCs w:val="24"/>
-    </w:rPr>
-  </w:style>
-  <w:style w:type="table" w:styleId="51">
-    <w:name w:val="Table Grid"/>
-    <w:basedOn w:val="50"/>
     <w:uiPriority w:val="59"/>
-    <w:qFormat/>
     <w:tblPr>
       <w:tblBorders>
         <w:top w:val="single" w:color="auto" w:sz="4" w:space="0"/>
@@ -2453,6 +2577,217 @@
         <w:insideV w:val="single" w:color="auto" w:sz="4" w:space="0"/>
       </w:tblBorders>
     </w:tblPr>
+  </w:style>
+  <w:style w:type="character" w:styleId="20">
+    <w:name w:val="Hyperlink"/>
+    <w:qFormat/>
+    <w:uiPriority w:val="99"/>
+    <w:rPr>
+      <w:rFonts w:ascii="Times New Roman" w:hAnsi="Times New Roman" w:eastAsia="宋体" w:cs="Times New Roman"/>
+      <w:color w:val="0563C1"/>
+      <w:sz w:val="24"/>
+      <w:szCs w:val="24"/>
+    </w:rPr>
+  </w:style>
+  <w:style w:type="paragraph" w:customStyle="1" w:styleId="21">
+    <w:name w:val="封面-项目名称"/>
+    <w:basedOn w:val="1"/>
+    <w:qFormat/>
+    <w:uiPriority w:val="2"/>
+    <w:pPr>
+      <w:spacing w:line="800" w:lineRule="auto"/>
+      <w:ind w:firstLine="0"/>
+      <w:jc w:val="center"/>
+    </w:pPr>
+    <w:rPr>
+      <w:rFonts w:ascii="黑体" w:hAnsi="黑体" w:eastAsia="黑体" w:cs="黑体"/>
+      <w:b/>
+      <w:bCs/>
+      <w:sz w:val="52"/>
+      <w:szCs w:val="52"/>
+    </w:rPr>
+  </w:style>
+  <w:style w:type="paragraph" w:customStyle="1" w:styleId="22">
+    <w:name w:val="封面-副标题"/>
+    <w:basedOn w:val="1"/>
+    <w:qFormat/>
+    <w:uiPriority w:val="3"/>
+    <w:pPr>
+      <w:spacing w:line="420" w:lineRule="auto"/>
+      <w:ind w:firstLine="0"/>
+      <w:jc w:val="center"/>
+    </w:pPr>
+    <w:rPr>
+      <w:rFonts w:ascii="黑体" w:hAnsi="黑体" w:eastAsia="黑体" w:cs="黑体"/>
+      <w:b/>
+      <w:bCs/>
+      <w:sz w:val="32"/>
+      <w:szCs w:val="32"/>
+    </w:rPr>
+  </w:style>
+  <w:style w:type="paragraph" w:customStyle="1" w:styleId="23">
+    <w:name w:val="封面-信息项"/>
+    <w:basedOn w:val="1"/>
+    <w:qFormat/>
+    <w:uiPriority w:val="4"/>
+    <w:pPr>
+      <w:spacing w:line="360" w:lineRule="auto"/>
+      <w:ind w:firstLine="0"/>
+      <w:jc w:val="left"/>
+    </w:pPr>
+    <w:rPr>
+      <w:rFonts w:ascii="Times New Roman" w:hAnsi="Times New Roman" w:eastAsia="宋体" w:cs="Times New Roman"/>
+      <w:sz w:val="28"/>
+      <w:szCs w:val="28"/>
+    </w:rPr>
+  </w:style>
+  <w:style w:type="paragraph" w:customStyle="1" w:styleId="24">
+    <w:name w:val="目录标题"/>
+    <w:basedOn w:val="1"/>
+    <w:qFormat/>
+    <w:uiPriority w:val="10"/>
+    <w:pPr>
+      <w:spacing w:before="240" w:after="240" w:line="360" w:lineRule="auto"/>
+      <w:ind w:firstLine="0"/>
+      <w:jc w:val="center"/>
+      <w:outlineLvl w:val="9"/>
+    </w:pPr>
+    <w:rPr>
+      <w:rFonts w:ascii="Times New Roman" w:hAnsi="Times New Roman" w:eastAsia="黑体" w:cs="Times New Roman"/>
+      <w:b/>
+      <w:bCs/>
+      <w:sz w:val="32"/>
+      <w:szCs w:val="32"/>
+    </w:rPr>
+  </w:style>
+  <w:style w:type="paragraph" w:customStyle="1" w:styleId="25">
+    <w:name w:val="题注1"/>
+    <w:basedOn w:val="1"/>
+    <w:qFormat/>
+    <w:uiPriority w:val="11"/>
+    <w:pPr>
+      <w:spacing w:before="120" w:after="120" w:line="300" w:lineRule="auto"/>
+      <w:ind w:firstLine="0"/>
+      <w:jc w:val="center"/>
+    </w:pPr>
+    <w:rPr>
+      <w:rFonts w:ascii="Times New Roman" w:hAnsi="Times New Roman" w:eastAsia="黑体" w:cs="Times New Roman"/>
+      <w:sz w:val="21"/>
+      <w:szCs w:val="21"/>
+    </w:rPr>
+  </w:style>
+  <w:style w:type="paragraph" w:customStyle="1" w:styleId="26">
+    <w:name w:val="表格-表头"/>
+    <w:basedOn w:val="1"/>
+    <w:qFormat/>
+    <w:uiPriority w:val="12"/>
+    <w:pPr>
+      <w:spacing w:line="300" w:lineRule="auto"/>
+      <w:ind w:firstLine="0"/>
+      <w:jc w:val="center"/>
+    </w:pPr>
+    <w:rPr>
+      <w:rFonts w:ascii="Times New Roman" w:hAnsi="Times New Roman" w:eastAsia="黑体" w:cs="Times New Roman"/>
+      <w:b/>
+      <w:bCs/>
+      <w:sz w:val="21"/>
+      <w:szCs w:val="21"/>
+    </w:rPr>
+  </w:style>
+  <w:style w:type="paragraph" w:customStyle="1" w:styleId="27">
+    <w:name w:val="表格-正文左对齐"/>
+    <w:basedOn w:val="1"/>
+    <w:qFormat/>
+    <w:uiPriority w:val="13"/>
+    <w:pPr>
+      <w:spacing w:line="300" w:lineRule="auto"/>
+      <w:ind w:firstLine="0"/>
+      <w:jc w:val="left"/>
+    </w:pPr>
+    <w:rPr>
+      <w:rFonts w:ascii="Times New Roman" w:hAnsi="Times New Roman" w:eastAsia="宋体" w:cs="Times New Roman"/>
+      <w:sz w:val="21"/>
+      <w:szCs w:val="21"/>
+    </w:rPr>
+  </w:style>
+  <w:style w:type="paragraph" w:customStyle="1" w:styleId="28">
+    <w:name w:val="表格-正文居中"/>
+    <w:basedOn w:val="1"/>
+    <w:qFormat/>
+    <w:uiPriority w:val="14"/>
+    <w:pPr>
+      <w:spacing w:line="300" w:lineRule="auto"/>
+      <w:ind w:firstLine="0"/>
+      <w:jc w:val="center"/>
+    </w:pPr>
+    <w:rPr>
+      <w:rFonts w:ascii="Times New Roman" w:hAnsi="Times New Roman" w:eastAsia="宋体" w:cs="Times New Roman"/>
+      <w:sz w:val="21"/>
+      <w:szCs w:val="21"/>
+    </w:rPr>
+  </w:style>
+  <w:style w:type="paragraph" w:customStyle="1" w:styleId="29">
+    <w:name w:val="表格-数字右对齐"/>
+    <w:basedOn w:val="1"/>
+    <w:qFormat/>
+    <w:uiPriority w:val="15"/>
+    <w:pPr>
+      <w:spacing w:line="300" w:lineRule="auto"/>
+      <w:ind w:firstLine="0"/>
+      <w:jc w:val="right"/>
+    </w:pPr>
+    <w:rPr>
+      <w:rFonts w:ascii="Times New Roman" w:hAnsi="Times New Roman" w:eastAsia="宋体" w:cs="Times New Roman"/>
+      <w:sz w:val="21"/>
+      <w:szCs w:val="21"/>
+    </w:rPr>
+  </w:style>
+  <w:style w:type="paragraph" w:customStyle="1" w:styleId="30">
+    <w:name w:val="图片占位说明"/>
+    <w:basedOn w:val="1"/>
+    <w:qFormat/>
+    <w:uiPriority w:val="16"/>
+    <w:pPr>
+      <w:spacing w:line="300" w:lineRule="auto"/>
+      <w:ind w:firstLine="0"/>
+      <w:jc w:val="center"/>
+    </w:pPr>
+    <w:rPr>
+      <w:rFonts w:ascii="Times New Roman" w:hAnsi="Times New Roman" w:eastAsia="宋体" w:cs="Times New Roman"/>
+      <w:color w:val="666666"/>
+      <w:sz w:val="21"/>
+      <w:szCs w:val="21"/>
+    </w:rPr>
+  </w:style>
+  <w:style w:type="paragraph" w:customStyle="1" w:styleId="31">
+    <w:name w:val="页脚1"/>
+    <w:basedOn w:val="1"/>
+    <w:uiPriority w:val="99"/>
+    <w:pPr>
+      <w:spacing w:line="240" w:lineRule="auto"/>
+      <w:ind w:firstLine="0"/>
+      <w:jc w:val="center"/>
+    </w:pPr>
+    <w:rPr>
+      <w:rFonts w:ascii="Times New Roman" w:hAnsi="Times New Roman" w:eastAsia="宋体" w:cs="Times New Roman"/>
+      <w:sz w:val="18"/>
+      <w:szCs w:val="18"/>
+    </w:rPr>
+  </w:style>
+  <w:style w:type="paragraph" w:customStyle="1" w:styleId="32">
+    <w:name w:val="页眉1"/>
+    <w:basedOn w:val="1"/>
+    <w:uiPriority w:val="99"/>
+    <w:pPr>
+      <w:spacing w:line="240" w:lineRule="auto"/>
+      <w:ind w:firstLine="0"/>
+      <w:jc w:val="left"/>
+    </w:pPr>
+    <w:rPr>
+      <w:rFonts w:ascii="Times New Roman" w:hAnsi="Times New Roman" w:eastAsia="宋体" w:cs="Times New Roman"/>
+      <w:sz w:val="18"/>
+      <w:szCs w:val="18"/>
+    </w:rPr>
   </w:style>
 </w:styles>
 </file>

</xml_diff>